<commit_message>
Guides: clickable app links; full-length F Block Spanish guide; online pages; AP Tests guides list updated
Co-Authored-By: Claude Sonnet 5.5 <noreply@anthropic.com>
Claude-Session: https://claude.ai/code/session_01HQewUzsAu4omaG8JGsraHZ
</commit_message>
<xml_diff>
--- a/Word documents/AP_A_Level_User_Guide.docx
+++ b/Word documents/AP_A_Level_User_Guide.docx
@@ -488,14 +488,20 @@
             <w:pPr>
               <w:spacing w:after="30"/>
             </w:pPr>
-            <w:r>
-              <w:rPr>
-                <w:rFonts w:ascii="Arial" w:cs="Arial" w:eastAsia="Arial" w:hAnsi="Arial"/>
-                <w:sz w:val="20"/>
-                <w:szCs w:val="20"/>
-              </w:rPr>
-              <w:t xml:space="preserve">AP Tests (set tests)</w:t>
-            </w:r>
+            <w:hyperlink w:history="1" r:id="rIdqa4zznnicj0qfmr8d70a6">
+              <w:r>
+                <w:rPr>
+                  <w:rFonts w:ascii="Arial" w:cs="Arial" w:eastAsia="Arial" w:hAnsi="Arial"/>
+                  <w:b/>
+                  <w:bCs/>
+                  <w:color w:val="0563C1"/>
+                  <w:sz w:val="20"/>
+                  <w:szCs w:val="20"/>
+                  <w:u w:val="single"/>
+                </w:rPr>
+                <w:t xml:space="preserve">AP Tests (set tests)</w:t>
+              </w:r>
+            </w:hyperlink>
           </w:p>
         </w:tc>
         <w:tc>
@@ -614,14 +620,20 @@
             <w:pPr>
               <w:spacing w:after="30"/>
             </w:pPr>
-            <w:r>
-              <w:rPr>
-                <w:rFonts w:ascii="Arial" w:cs="Arial" w:eastAsia="Arial" w:hAnsi="Arial"/>
-                <w:sz w:val="20"/>
-                <w:szCs w:val="20"/>
-              </w:rPr>
-              <w:t xml:space="preserve">AP A Level French Oral Topics &amp; Paper 1 Practice</w:t>
-            </w:r>
+            <w:hyperlink w:history="1" r:id="rIdaks4ukwbcvv9htisoi7qt">
+              <w:r>
+                <w:rPr>
+                  <w:rFonts w:ascii="Arial" w:cs="Arial" w:eastAsia="Arial" w:hAnsi="Arial"/>
+                  <w:b/>
+                  <w:bCs/>
+                  <w:color w:val="0563C1"/>
+                  <w:sz w:val="20"/>
+                  <w:szCs w:val="20"/>
+                  <w:u w:val="single"/>
+                </w:rPr>
+                <w:t xml:space="preserve">AP A Level French Oral Topics &amp; Paper 1 Practice</w:t>
+              </w:r>
+            </w:hyperlink>
           </w:p>
         </w:tc>
         <w:tc>
@@ -742,14 +754,20 @@
             <w:pPr>
               <w:spacing w:after="30"/>
             </w:pPr>
-            <w:r>
-              <w:rPr>
-                <w:rFonts w:ascii="Arial" w:cs="Arial" w:eastAsia="Arial" w:hAnsi="Arial"/>
-                <w:sz w:val="20"/>
-                <w:szCs w:val="20"/>
-              </w:rPr>
-              <w:t xml:space="preserve">AP A Level French VVs &amp; Gr EWs &amp; Grammar Translation Practice and Drills</w:t>
-            </w:r>
+            <w:hyperlink w:history="1" r:id="rIdcw7dtyw4ct9mapekz61uh">
+              <w:r>
+                <w:rPr>
+                  <w:rFonts w:ascii="Arial" w:cs="Arial" w:eastAsia="Arial" w:hAnsi="Arial"/>
+                  <w:b/>
+                  <w:bCs/>
+                  <w:color w:val="0563C1"/>
+                  <w:sz w:val="20"/>
+                  <w:szCs w:val="20"/>
+                  <w:u w:val="single"/>
+                </w:rPr>
+                <w:t xml:space="preserve">AP A Level French VVs &amp; Gr EWs &amp; Grammar Translation Practice and Drills</w:t>
+              </w:r>
+            </w:hyperlink>
           </w:p>
         </w:tc>
         <w:tc>
@@ -868,14 +886,20 @@
             <w:pPr>
               <w:spacing w:after="30"/>
             </w:pPr>
-            <w:r>
-              <w:rPr>
-                <w:rFonts w:ascii="Arial" w:cs="Arial" w:eastAsia="Arial" w:hAnsi="Arial"/>
-                <w:sz w:val="20"/>
-                <w:szCs w:val="20"/>
-              </w:rPr>
-              <w:t xml:space="preserve">AP A Level Oral Phrase Bank</w:t>
-            </w:r>
+            <w:hyperlink w:history="1" r:id="rIdmigbkz5yialzy7zcna6in">
+              <w:r>
+                <w:rPr>
+                  <w:rFonts w:ascii="Arial" w:cs="Arial" w:eastAsia="Arial" w:hAnsi="Arial"/>
+                  <w:b/>
+                  <w:bCs/>
+                  <w:color w:val="0563C1"/>
+                  <w:sz w:val="20"/>
+                  <w:szCs w:val="20"/>
+                  <w:u w:val="single"/>
+                </w:rPr>
+                <w:t xml:space="preserve">AP A Level Oral Phrase Bank</w:t>
+              </w:r>
+            </w:hyperlink>
           </w:p>
         </w:tc>
         <w:tc>
@@ -996,14 +1020,20 @@
             <w:pPr>
               <w:spacing w:after="30"/>
             </w:pPr>
-            <w:r>
-              <w:rPr>
-                <w:rFonts w:ascii="Arial" w:cs="Arial" w:eastAsia="Arial" w:hAnsi="Arial"/>
-                <w:sz w:val="20"/>
-                <w:szCs w:val="20"/>
-              </w:rPr>
-              <w:t xml:space="preserve">AP Gen Essential Phrases</w:t>
-            </w:r>
+            <w:hyperlink w:history="1" r:id="rIdrx8v2j84gkaqovnvj4239">
+              <w:r>
+                <w:rPr>
+                  <w:rFonts w:ascii="Arial" w:cs="Arial" w:eastAsia="Arial" w:hAnsi="Arial"/>
+                  <w:b/>
+                  <w:bCs/>
+                  <w:color w:val="0563C1"/>
+                  <w:sz w:val="20"/>
+                  <w:szCs w:val="20"/>
+                  <w:u w:val="single"/>
+                </w:rPr>
+                <w:t xml:space="preserve">AP Gen Essential Phrases</w:t>
+              </w:r>
+            </w:hyperlink>
           </w:p>
         </w:tc>
         <w:tc>
@@ -1477,28 +1507,12 @@
             <w:r>
               <w:rPr>
                 <w:rFonts w:ascii="Arial" w:cs="Arial" w:eastAsia="Arial" w:hAnsi="Arial"/>
-                <w:sz w:val="20"/>
-                <w:szCs w:val="20"/>
-              </w:rPr>
-              <w:t xml:space="preserve"/>
-            </w:r>
-            <w:r>
-              <w:rPr>
-                <w:rFonts w:ascii="Arial" w:cs="Arial" w:eastAsia="Arial" w:hAnsi="Arial"/>
                 <w:b/>
                 <w:bCs/>
                 <w:sz w:val="20"/>
                 <w:szCs w:val="20"/>
               </w:rPr>
               <w:t xml:space="preserve">Direction</w:t>
-            </w:r>
-            <w:r>
-              <w:rPr>
-                <w:rFonts w:ascii="Arial" w:cs="Arial" w:eastAsia="Arial" w:hAnsi="Arial"/>
-                <w:sz w:val="20"/>
-                <w:szCs w:val="20"/>
-              </w:rPr>
-              <w:t xml:space="preserve"/>
             </w:r>
           </w:p>
         </w:tc>
@@ -1579,28 +1593,12 @@
             <w:r>
               <w:rPr>
                 <w:rFonts w:ascii="Arial" w:cs="Arial" w:eastAsia="Arial" w:hAnsi="Arial"/>
-                <w:sz w:val="20"/>
-                <w:szCs w:val="20"/>
-              </w:rPr>
-              <w:t xml:space="preserve"/>
-            </w:r>
-            <w:r>
-              <w:rPr>
-                <w:rFonts w:ascii="Arial" w:cs="Arial" w:eastAsia="Arial" w:hAnsi="Arial"/>
                 <w:b/>
                 <w:bCs/>
                 <w:sz w:val="20"/>
                 <w:szCs w:val="20"/>
               </w:rPr>
               <w:t xml:space="preserve">Cards per session</w:t>
-            </w:r>
-            <w:r>
-              <w:rPr>
-                <w:rFonts w:ascii="Arial" w:cs="Arial" w:eastAsia="Arial" w:hAnsi="Arial"/>
-                <w:sz w:val="20"/>
-                <w:szCs w:val="20"/>
-              </w:rPr>
-              <w:t xml:space="preserve"/>
             </w:r>
           </w:p>
         </w:tc>
@@ -1663,28 +1661,12 @@
             <w:r>
               <w:rPr>
                 <w:rFonts w:ascii="Arial" w:cs="Arial" w:eastAsia="Arial" w:hAnsi="Arial"/>
-                <w:sz w:val="20"/>
-                <w:szCs w:val="20"/>
-              </w:rPr>
-              <w:t xml:space="preserve"/>
-            </w:r>
-            <w:r>
-              <w:rPr>
-                <w:rFonts w:ascii="Arial" w:cs="Arial" w:eastAsia="Arial" w:hAnsi="Arial"/>
                 <w:b/>
                 <w:bCs/>
                 <w:sz w:val="20"/>
                 <w:szCs w:val="20"/>
               </w:rPr>
               <w:t xml:space="preserve">Timer per card</w:t>
-            </w:r>
-            <w:r>
-              <w:rPr>
-                <w:rFonts w:ascii="Arial" w:cs="Arial" w:eastAsia="Arial" w:hAnsi="Arial"/>
-                <w:sz w:val="20"/>
-                <w:szCs w:val="20"/>
-              </w:rPr>
-              <w:t xml:space="preserve"/>
             </w:r>
           </w:p>
         </w:tc>
@@ -1747,28 +1729,12 @@
             <w:r>
               <w:rPr>
                 <w:rFonts w:ascii="Arial" w:cs="Arial" w:eastAsia="Arial" w:hAnsi="Arial"/>
-                <w:sz w:val="20"/>
-                <w:szCs w:val="20"/>
-              </w:rPr>
-              <w:t xml:space="preserve"/>
-            </w:r>
-            <w:r>
-              <w:rPr>
-                <w:rFonts w:ascii="Arial" w:cs="Arial" w:eastAsia="Arial" w:hAnsi="Arial"/>
                 <w:b/>
                 <w:bCs/>
                 <w:sz w:val="20"/>
                 <w:szCs w:val="20"/>
               </w:rPr>
               <w:t xml:space="preserve">Level: Easy / Medium / Hard</w:t>
-            </w:r>
-            <w:r>
-              <w:rPr>
-                <w:rFonts w:ascii="Arial" w:cs="Arial" w:eastAsia="Arial" w:hAnsi="Arial"/>
-                <w:sz w:val="20"/>
-                <w:szCs w:val="20"/>
-              </w:rPr>
-              <w:t xml:space="preserve"/>
             </w:r>
           </w:p>
         </w:tc>
@@ -1885,28 +1851,12 @@
             <w:r>
               <w:rPr>
                 <w:rFonts w:ascii="Arial" w:cs="Arial" w:eastAsia="Arial" w:hAnsi="Arial"/>
-                <w:sz w:val="20"/>
-                <w:szCs w:val="20"/>
-              </w:rPr>
-              <w:t xml:space="preserve"/>
-            </w:r>
-            <w:r>
-              <w:rPr>
-                <w:rFonts w:ascii="Arial" w:cs="Arial" w:eastAsia="Arial" w:hAnsi="Arial"/>
                 <w:b/>
                 <w:bCs/>
                 <w:sz w:val="20"/>
                 <w:szCs w:val="20"/>
               </w:rPr>
               <w:t xml:space="preserve">▶ Start Drill · N cards</w:t>
-            </w:r>
-            <w:r>
-              <w:rPr>
-                <w:rFonts w:ascii="Arial" w:cs="Arial" w:eastAsia="Arial" w:hAnsi="Arial"/>
-                <w:sz w:val="20"/>
-                <w:szCs w:val="20"/>
-              </w:rPr>
-              <w:t xml:space="preserve"/>
             </w:r>
           </w:p>
         </w:tc>
@@ -1969,28 +1919,12 @@
             <w:r>
               <w:rPr>
                 <w:rFonts w:ascii="Arial" w:cs="Arial" w:eastAsia="Arial" w:hAnsi="Arial"/>
-                <w:sz w:val="20"/>
-                <w:szCs w:val="20"/>
-              </w:rPr>
-              <w:t xml:space="preserve"/>
-            </w:r>
-            <w:r>
-              <w:rPr>
-                <w:rFonts w:ascii="Arial" w:cs="Arial" w:eastAsia="Arial" w:hAnsi="Arial"/>
                 <w:b/>
                 <w:bCs/>
                 <w:sz w:val="20"/>
                 <w:szCs w:val="20"/>
               </w:rPr>
               <w:t xml:space="preserve">☕ Leisure Mode</w:t>
-            </w:r>
-            <w:r>
-              <w:rPr>
-                <w:rFonts w:ascii="Arial" w:cs="Arial" w:eastAsia="Arial" w:hAnsi="Arial"/>
-                <w:sz w:val="20"/>
-                <w:szCs w:val="20"/>
-              </w:rPr>
-              <w:t xml:space="preserve"/>
             </w:r>
           </w:p>
         </w:tc>
@@ -2053,28 +1987,12 @@
             <w:r>
               <w:rPr>
                 <w:rFonts w:ascii="Arial" w:cs="Arial" w:eastAsia="Arial" w:hAnsi="Arial"/>
-                <w:sz w:val="20"/>
-                <w:szCs w:val="20"/>
-              </w:rPr>
-              <w:t xml:space="preserve"/>
-            </w:r>
-            <w:r>
-              <w:rPr>
-                <w:rFonts w:ascii="Arial" w:cs="Arial" w:eastAsia="Arial" w:hAnsi="Arial"/>
                 <w:b/>
                 <w:bCs/>
                 <w:sz w:val="20"/>
                 <w:szCs w:val="20"/>
               </w:rPr>
               <w:t xml:space="preserve">⏱ Autotime: On/Off</w:t>
-            </w:r>
-            <w:r>
-              <w:rPr>
-                <w:rFonts w:ascii="Arial" w:cs="Arial" w:eastAsia="Arial" w:hAnsi="Arial"/>
-                <w:sz w:val="20"/>
-                <w:szCs w:val="20"/>
-              </w:rPr>
-              <w:t xml:space="preserve"/>
             </w:r>
           </w:p>
         </w:tc>
@@ -2137,28 +2055,12 @@
             <w:r>
               <w:rPr>
                 <w:rFonts w:ascii="Arial" w:cs="Arial" w:eastAsia="Arial" w:hAnsi="Arial"/>
-                <w:sz w:val="20"/>
-                <w:szCs w:val="20"/>
-              </w:rPr>
-              <w:t xml:space="preserve"/>
-            </w:r>
-            <w:r>
-              <w:rPr>
-                <w:rFonts w:ascii="Arial" w:cs="Arial" w:eastAsia="Arial" w:hAnsi="Arial"/>
                 <w:b/>
                 <w:bCs/>
                 <w:sz w:val="20"/>
                 <w:szCs w:val="20"/>
               </w:rPr>
               <w:t xml:space="preserve">📝 Generate Test</w:t>
-            </w:r>
-            <w:r>
-              <w:rPr>
-                <w:rFonts w:ascii="Arial" w:cs="Arial" w:eastAsia="Arial" w:hAnsi="Arial"/>
-                <w:sz w:val="20"/>
-                <w:szCs w:val="20"/>
-              </w:rPr>
-              <w:t xml:space="preserve"/>
             </w:r>
           </w:p>
         </w:tc>
@@ -2221,28 +2123,12 @@
             <w:r>
               <w:rPr>
                 <w:rFonts w:ascii="Arial" w:cs="Arial" w:eastAsia="Arial" w:hAnsi="Arial"/>
-                <w:sz w:val="20"/>
-                <w:szCs w:val="20"/>
-              </w:rPr>
-              <w:t xml:space="preserve"/>
-            </w:r>
-            <w:r>
-              <w:rPr>
-                <w:rFonts w:ascii="Arial" w:cs="Arial" w:eastAsia="Arial" w:hAnsi="Arial"/>
                 <w:b/>
                 <w:bCs/>
                 <w:sz w:val="20"/>
                 <w:szCs w:val="20"/>
               </w:rPr>
               <w:t xml:space="preserve">📖 View &amp; Print</w:t>
-            </w:r>
-            <w:r>
-              <w:rPr>
-                <w:rFonts w:ascii="Arial" w:cs="Arial" w:eastAsia="Arial" w:hAnsi="Arial"/>
-                <w:sz w:val="20"/>
-                <w:szCs w:val="20"/>
-              </w:rPr>
-              <w:t xml:space="preserve"/>
             </w:r>
           </w:p>
         </w:tc>
@@ -2305,28 +2191,12 @@
             <w:r>
               <w:rPr>
                 <w:rFonts w:ascii="Arial" w:cs="Arial" w:eastAsia="Arial" w:hAnsi="Arial"/>
-                <w:sz w:val="20"/>
-                <w:szCs w:val="20"/>
-              </w:rPr>
-              <w:t xml:space="preserve"/>
-            </w:r>
-            <w:r>
-              <w:rPr>
-                <w:rFonts w:ascii="Arial" w:cs="Arial" w:eastAsia="Arial" w:hAnsi="Arial"/>
                 <w:b/>
                 <w:bCs/>
                 <w:sz w:val="20"/>
                 <w:szCs w:val="20"/>
               </w:rPr>
               <w:t xml:space="preserve">📚 Choose lists / topics / sections</w:t>
-            </w:r>
-            <w:r>
-              <w:rPr>
-                <w:rFonts w:ascii="Arial" w:cs="Arial" w:eastAsia="Arial" w:hAnsi="Arial"/>
-                <w:sz w:val="20"/>
-                <w:szCs w:val="20"/>
-              </w:rPr>
-              <w:t xml:space="preserve"/>
             </w:r>
           </w:p>
         </w:tc>
@@ -2389,28 +2259,12 @@
             <w:r>
               <w:rPr>
                 <w:rFonts w:ascii="Arial" w:cs="Arial" w:eastAsia="Arial" w:hAnsi="Arial"/>
-                <w:sz w:val="20"/>
-                <w:szCs w:val="20"/>
-              </w:rPr>
-              <w:t xml:space="preserve"/>
-            </w:r>
-            <w:r>
-              <w:rPr>
-                <w:rFonts w:ascii="Arial" w:cs="Arial" w:eastAsia="Arial" w:hAnsi="Arial"/>
                 <w:b/>
                 <w:bCs/>
                 <w:sz w:val="20"/>
                 <w:szCs w:val="20"/>
               </w:rPr>
               <w:t xml:space="preserve">⚡ AP Speed Challenge</w:t>
-            </w:r>
-            <w:r>
-              <w:rPr>
-                <w:rFonts w:ascii="Arial" w:cs="Arial" w:eastAsia="Arial" w:hAnsi="Arial"/>
-                <w:sz w:val="20"/>
-                <w:szCs w:val="20"/>
-              </w:rPr>
-              <w:t xml:space="preserve"/>
             </w:r>
           </w:p>
         </w:tc>
@@ -2563,14 +2417,6 @@
         </w:numPr>
         <w:spacing w:after="70" w:line="276"/>
       </w:pPr>
-      <w:r>
-        <w:rPr>
-          <w:rFonts w:ascii="Arial" w:cs="Arial" w:eastAsia="Arial" w:hAnsi="Arial"/>
-          <w:sz w:val="22"/>
-          <w:szCs w:val="22"/>
-        </w:rPr>
-        <w:t xml:space="preserve"/>
-      </w:r>
       <w:r>
         <w:rPr>
           <w:rFonts w:ascii="Arial" w:cs="Arial" w:eastAsia="Arial" w:hAnsi="Arial"/>
@@ -2849,28 +2695,12 @@
             <w:r>
               <w:rPr>
                 <w:rFonts w:ascii="Arial" w:cs="Arial" w:eastAsia="Arial" w:hAnsi="Arial"/>
-                <w:sz w:val="20"/>
-                <w:szCs w:val="20"/>
-              </w:rPr>
-              <w:t xml:space="preserve"/>
-            </w:r>
-            <w:r>
-              <w:rPr>
-                <w:rFonts w:ascii="Arial" w:cs="Arial" w:eastAsia="Arial" w:hAnsi="Arial"/>
                 <w:b/>
                 <w:bCs/>
                 <w:sz w:val="20"/>
                 <w:szCs w:val="20"/>
               </w:rPr>
               <w:t xml:space="preserve">✗ Major error</w:t>
-            </w:r>
-            <w:r>
-              <w:rPr>
-                <w:rFonts w:ascii="Arial" w:cs="Arial" w:eastAsia="Arial" w:hAnsi="Arial"/>
-                <w:sz w:val="20"/>
-                <w:szCs w:val="20"/>
-              </w:rPr>
-              <w:t xml:space="preserve"/>
             </w:r>
           </w:p>
         </w:tc>
@@ -2963,28 +2793,12 @@
             <w:r>
               <w:rPr>
                 <w:rFonts w:ascii="Arial" w:cs="Arial" w:eastAsia="Arial" w:hAnsi="Arial"/>
-                <w:sz w:val="20"/>
-                <w:szCs w:val="20"/>
-              </w:rPr>
-              <w:t xml:space="preserve"/>
-            </w:r>
-            <w:r>
-              <w:rPr>
-                <w:rFonts w:ascii="Arial" w:cs="Arial" w:eastAsia="Arial" w:hAnsi="Arial"/>
                 <w:b/>
                 <w:bCs/>
                 <w:sz w:val="20"/>
                 <w:szCs w:val="20"/>
               </w:rPr>
               <w:t xml:space="preserve">~ Nearly</w:t>
-            </w:r>
-            <w:r>
-              <w:rPr>
-                <w:rFonts w:ascii="Arial" w:cs="Arial" w:eastAsia="Arial" w:hAnsi="Arial"/>
-                <w:sz w:val="20"/>
-                <w:szCs w:val="20"/>
-              </w:rPr>
-              <w:t xml:space="preserve"/>
             </w:r>
           </w:p>
         </w:tc>
@@ -3078,14 +2892,6 @@
             <w:r>
               <w:rPr>
                 <w:rFonts w:ascii="Arial" w:cs="Arial" w:eastAsia="Arial" w:hAnsi="Arial"/>
-                <w:sz w:val="20"/>
-                <w:szCs w:val="20"/>
-              </w:rPr>
-              <w:t xml:space="preserve"/>
-            </w:r>
-            <w:r>
-              <w:rPr>
-                <w:rFonts w:ascii="Arial" w:cs="Arial" w:eastAsia="Arial" w:hAnsi="Arial"/>
                 <w:b/>
                 <w:bCs/>
                 <w:sz w:val="20"/>
@@ -3093,14 +2899,6 @@
               </w:rPr>
               <w:t xml:space="preserve">✓ Got it</w:t>
             </w:r>
-            <w:r>
-              <w:rPr>
-                <w:rFonts w:ascii="Arial" w:cs="Arial" w:eastAsia="Arial" w:hAnsi="Arial"/>
-                <w:sz w:val="20"/>
-                <w:szCs w:val="20"/>
-              </w:rPr>
-              <w:t xml:space="preserve"/>
-            </w:r>
           </w:p>
         </w:tc>
         <w:tc>
@@ -3174,14 +2972,6 @@
       <w:pPr>
         <w:spacing w:after="120" w:line="276"/>
       </w:pPr>
-      <w:r>
-        <w:rPr>
-          <w:rFonts w:ascii="Arial" w:cs="Arial" w:eastAsia="Arial" w:hAnsi="Arial"/>
-          <w:sz w:val="22"/>
-          <w:szCs w:val="22"/>
-        </w:rPr>
-        <w:t xml:space="preserve"/>
-      </w:r>
       <w:r>
         <w:rPr>
           <w:rFonts w:ascii="Arial" w:cs="Arial" w:eastAsia="Arial" w:hAnsi="Arial"/>
@@ -3285,14 +3075,6 @@
       <w:r>
         <w:rPr>
           <w:rFonts w:ascii="Arial" w:cs="Arial" w:eastAsia="Arial" w:hAnsi="Arial"/>
-          <w:sz w:val="22"/>
-          <w:szCs w:val="22"/>
-        </w:rPr>
-        <w:t xml:space="preserve"/>
-      </w:r>
-      <w:r>
-        <w:rPr>
-          <w:rFonts w:ascii="Arial" w:cs="Arial" w:eastAsia="Arial" w:hAnsi="Arial"/>
           <w:b/>
           <w:bCs/>
           <w:sz w:val="22"/>
@@ -3321,14 +3103,6 @@
       <w:r>
         <w:rPr>
           <w:rFonts w:ascii="Arial" w:cs="Arial" w:eastAsia="Arial" w:hAnsi="Arial"/>
-          <w:sz w:val="22"/>
-          <w:szCs w:val="22"/>
-        </w:rPr>
-        <w:t xml:space="preserve"/>
-      </w:r>
-      <w:r>
-        <w:rPr>
-          <w:rFonts w:ascii="Arial" w:cs="Arial" w:eastAsia="Arial" w:hAnsi="Arial"/>
           <w:b/>
           <w:bCs/>
           <w:sz w:val="22"/>
@@ -3534,14 +3308,6 @@
         </w:numPr>
         <w:spacing w:after="60" w:line="276"/>
       </w:pPr>
-      <w:r>
-        <w:rPr>
-          <w:rFonts w:ascii="Arial" w:cs="Arial" w:eastAsia="Arial" w:hAnsi="Arial"/>
-          <w:sz w:val="22"/>
-          <w:szCs w:val="22"/>
-        </w:rPr>
-        <w:t xml:space="preserve"/>
-      </w:r>
       <w:r>
         <w:rPr>
           <w:rFonts w:ascii="Arial" w:cs="Arial" w:eastAsia="Arial" w:hAnsi="Arial"/>
@@ -3741,14 +3507,6 @@
         </w:rPr>
         <w:t xml:space="preserve">There is no marking, no score and no error list.</w:t>
       </w:r>
-      <w:r>
-        <w:rPr>
-          <w:rFonts w:ascii="Arial" w:cs="Arial" w:eastAsia="Arial" w:hAnsi="Arial"/>
-          <w:sz w:val="22"/>
-          <w:szCs w:val="22"/>
-        </w:rPr>
-        <w:t xml:space="preserve"/>
-      </w:r>
     </w:p>
     <w:p>
       <w:pPr>
@@ -3762,14 +3520,6 @@
       <w:r>
         <w:rPr>
           <w:rFonts w:ascii="Arial" w:cs="Arial" w:eastAsia="Arial" w:hAnsi="Arial"/>
-          <w:sz w:val="22"/>
-          <w:szCs w:val="22"/>
-        </w:rPr>
-        <w:t xml:space="preserve"/>
-      </w:r>
-      <w:r>
-        <w:rPr>
-          <w:rFonts w:ascii="Arial" w:cs="Arial" w:eastAsia="Arial" w:hAnsi="Arial"/>
           <w:b/>
           <w:bCs/>
           <w:sz w:val="22"/>
@@ -3798,14 +3548,6 @@
       <w:r>
         <w:rPr>
           <w:rFonts w:ascii="Arial" w:cs="Arial" w:eastAsia="Arial" w:hAnsi="Arial"/>
-          <w:sz w:val="22"/>
-          <w:szCs w:val="22"/>
-        </w:rPr>
-        <w:t xml:space="preserve"/>
-      </w:r>
-      <w:r>
-        <w:rPr>
-          <w:rFonts w:ascii="Arial" w:cs="Arial" w:eastAsia="Arial" w:hAnsi="Arial"/>
           <w:b/>
           <w:bCs/>
           <w:sz w:val="22"/>
@@ -3849,14 +3591,6 @@
         </w:numPr>
         <w:spacing w:after="60" w:line="276"/>
       </w:pPr>
-      <w:r>
-        <w:rPr>
-          <w:rFonts w:ascii="Arial" w:cs="Arial" w:eastAsia="Arial" w:hAnsi="Arial"/>
-          <w:sz w:val="22"/>
-          <w:szCs w:val="22"/>
-        </w:rPr>
-        <w:t xml:space="preserve"/>
-      </w:r>
       <w:r>
         <w:rPr>
           <w:rFonts w:ascii="Arial" w:cs="Arial" w:eastAsia="Arial" w:hAnsi="Arial"/>
@@ -4773,28 +4507,12 @@
             <w:r>
               <w:rPr>
                 <w:rFonts w:ascii="Arial" w:cs="Arial" w:eastAsia="Arial" w:hAnsi="Arial"/>
-                <w:sz w:val="20"/>
-                <w:szCs w:val="20"/>
-              </w:rPr>
-              <w:t xml:space="preserve"/>
-            </w:r>
-            <w:r>
-              <w:rPr>
-                <w:rFonts w:ascii="Arial" w:cs="Arial" w:eastAsia="Arial" w:hAnsi="Arial"/>
                 <w:b/>
                 <w:bCs/>
                 <w:sz w:val="20"/>
                 <w:szCs w:val="20"/>
               </w:rPr>
               <w:t xml:space="preserve">📝 Generate Test</w:t>
-            </w:r>
-            <w:r>
-              <w:rPr>
-                <w:rFonts w:ascii="Arial" w:cs="Arial" w:eastAsia="Arial" w:hAnsi="Arial"/>
-                <w:sz w:val="20"/>
-                <w:szCs w:val="20"/>
-              </w:rPr>
-              <w:t xml:space="preserve"/>
             </w:r>
           </w:p>
         </w:tc>
@@ -4911,28 +4629,12 @@
             <w:r>
               <w:rPr>
                 <w:rFonts w:ascii="Arial" w:cs="Arial" w:eastAsia="Arial" w:hAnsi="Arial"/>
-                <w:sz w:val="20"/>
-                <w:szCs w:val="20"/>
-              </w:rPr>
-              <w:t xml:space="preserve"/>
-            </w:r>
-            <w:r>
-              <w:rPr>
-                <w:rFonts w:ascii="Arial" w:cs="Arial" w:eastAsia="Arial" w:hAnsi="Arial"/>
                 <w:b/>
                 <w:bCs/>
                 <w:sz w:val="20"/>
                 <w:szCs w:val="20"/>
               </w:rPr>
               <w:t xml:space="preserve">📋 AP Spot Test</w:t>
-            </w:r>
-            <w:r>
-              <w:rPr>
-                <w:rFonts w:ascii="Arial" w:cs="Arial" w:eastAsia="Arial" w:hAnsi="Arial"/>
-                <w:sz w:val="20"/>
-                <w:szCs w:val="20"/>
-              </w:rPr>
-              <w:t xml:space="preserve"/>
             </w:r>
           </w:p>
         </w:tc>
@@ -5013,28 +4715,12 @@
             <w:r>
               <w:rPr>
                 <w:rFonts w:ascii="Arial" w:cs="Arial" w:eastAsia="Arial" w:hAnsi="Arial"/>
-                <w:sz w:val="20"/>
-                <w:szCs w:val="20"/>
-              </w:rPr>
-              <w:t xml:space="preserve"/>
-            </w:r>
-            <w:r>
-              <w:rPr>
-                <w:rFonts w:ascii="Arial" w:cs="Arial" w:eastAsia="Arial" w:hAnsi="Arial"/>
                 <w:b/>
                 <w:bCs/>
                 <w:sz w:val="20"/>
                 <w:szCs w:val="20"/>
               </w:rPr>
               <w:t xml:space="preserve">⏱ AP Spot Test: timed &amp; submitted</w:t>
-            </w:r>
-            <w:r>
-              <w:rPr>
-                <w:rFonts w:ascii="Arial" w:cs="Arial" w:eastAsia="Arial" w:hAnsi="Arial"/>
-                <w:sz w:val="20"/>
-                <w:szCs w:val="20"/>
-              </w:rPr>
-              <w:t xml:space="preserve"/>
             </w:r>
           </w:p>
         </w:tc>
@@ -5683,14 +5369,6 @@
                 <w:szCs w:val="21"/>
               </w:rPr>
               <w:t xml:space="preserve">Careful  </w:t>
-            </w:r>
-            <w:r>
-              <w:rPr>
-                <w:rFonts w:ascii="Arial" w:cs="Arial" w:eastAsia="Arial" w:hAnsi="Arial"/>
-                <w:sz w:val="21"/>
-                <w:szCs w:val="21"/>
-              </w:rPr>
-              <w:t xml:space="preserve"/>
             </w:r>
             <w:r>
               <w:rPr>
@@ -6751,14 +6429,6 @@
             <w:r>
               <w:rPr>
                 <w:rFonts w:ascii="Arial" w:cs="Arial" w:eastAsia="Arial" w:hAnsi="Arial"/>
-                <w:sz w:val="20"/>
-                <w:szCs w:val="20"/>
-              </w:rPr>
-              <w:t xml:space="preserve"/>
-            </w:r>
-            <w:r>
-              <w:rPr>
-                <w:rFonts w:ascii="Arial" w:cs="Arial" w:eastAsia="Arial" w:hAnsi="Arial"/>
                 <w:b/>
                 <w:bCs/>
                 <w:sz w:val="20"/>
@@ -6835,14 +6505,6 @@
             <w:r>
               <w:rPr>
                 <w:rFonts w:ascii="Arial" w:cs="Arial" w:eastAsia="Arial" w:hAnsi="Arial"/>
-                <w:sz w:val="20"/>
-                <w:szCs w:val="20"/>
-              </w:rPr>
-              <w:t xml:space="preserve"/>
-            </w:r>
-            <w:r>
-              <w:rPr>
-                <w:rFonts w:ascii="Arial" w:cs="Arial" w:eastAsia="Arial" w:hAnsi="Arial"/>
                 <w:b/>
                 <w:bCs/>
                 <w:sz w:val="20"/>
@@ -6919,14 +6581,6 @@
             <w:r>
               <w:rPr>
                 <w:rFonts w:ascii="Arial" w:cs="Arial" w:eastAsia="Arial" w:hAnsi="Arial"/>
-                <w:sz w:val="20"/>
-                <w:szCs w:val="20"/>
-              </w:rPr>
-              <w:t xml:space="preserve"/>
-            </w:r>
-            <w:r>
-              <w:rPr>
-                <w:rFonts w:ascii="Arial" w:cs="Arial" w:eastAsia="Arial" w:hAnsi="Arial"/>
                 <w:b/>
                 <w:bCs/>
                 <w:sz w:val="20"/>
@@ -7003,14 +6657,6 @@
             <w:r>
               <w:rPr>
                 <w:rFonts w:ascii="Arial" w:cs="Arial" w:eastAsia="Arial" w:hAnsi="Arial"/>
-                <w:sz w:val="20"/>
-                <w:szCs w:val="20"/>
-              </w:rPr>
-              <w:t xml:space="preserve"/>
-            </w:r>
-            <w:r>
-              <w:rPr>
-                <w:rFonts w:ascii="Arial" w:cs="Arial" w:eastAsia="Arial" w:hAnsi="Arial"/>
                 <w:b/>
                 <w:bCs/>
                 <w:sz w:val="20"/>
@@ -7087,14 +6733,6 @@
             <w:r>
               <w:rPr>
                 <w:rFonts w:ascii="Arial" w:cs="Arial" w:eastAsia="Arial" w:hAnsi="Arial"/>
-                <w:sz w:val="20"/>
-                <w:szCs w:val="20"/>
-              </w:rPr>
-              <w:t xml:space="preserve"/>
-            </w:r>
-            <w:r>
-              <w:rPr>
-                <w:rFonts w:ascii="Arial" w:cs="Arial" w:eastAsia="Arial" w:hAnsi="Arial"/>
                 <w:b/>
                 <w:bCs/>
                 <w:sz w:val="20"/>
@@ -7168,14 +6806,6 @@
             <w:pPr>
               <w:spacing w:after="30"/>
             </w:pPr>
-            <w:r>
-              <w:rPr>
-                <w:rFonts w:ascii="Arial" w:cs="Arial" w:eastAsia="Arial" w:hAnsi="Arial"/>
-                <w:sz w:val="20"/>
-                <w:szCs w:val="20"/>
-              </w:rPr>
-              <w:t xml:space="preserve"/>
-            </w:r>
             <w:r>
               <w:rPr>
                 <w:rFonts w:ascii="Arial" w:cs="Arial" w:eastAsia="Arial" w:hAnsi="Arial"/>
@@ -7259,14 +6889,6 @@
       <w:r>
         <w:rPr>
           <w:rFonts w:ascii="Arial" w:cs="Arial" w:eastAsia="Arial" w:hAnsi="Arial"/>
-          <w:sz w:val="22"/>
-          <w:szCs w:val="22"/>
-        </w:rPr>
-        <w:t xml:space="preserve"/>
-      </w:r>
-      <w:r>
-        <w:rPr>
-          <w:rFonts w:ascii="Arial" w:cs="Arial" w:eastAsia="Arial" w:hAnsi="Arial"/>
           <w:b/>
           <w:bCs/>
           <w:sz w:val="22"/>
@@ -7295,14 +6917,6 @@
       <w:r>
         <w:rPr>
           <w:rFonts w:ascii="Arial" w:cs="Arial" w:eastAsia="Arial" w:hAnsi="Arial"/>
-          <w:sz w:val="22"/>
-          <w:szCs w:val="22"/>
-        </w:rPr>
-        <w:t xml:space="preserve"/>
-      </w:r>
-      <w:r>
-        <w:rPr>
-          <w:rFonts w:ascii="Arial" w:cs="Arial" w:eastAsia="Arial" w:hAnsi="Arial"/>
           <w:b/>
           <w:bCs/>
           <w:sz w:val="22"/>
@@ -7377,14 +6991,6 @@
       <w:pPr>
         <w:spacing w:after="120" w:line="276"/>
       </w:pPr>
-      <w:r>
-        <w:rPr>
-          <w:rFonts w:ascii="Arial" w:cs="Arial" w:eastAsia="Arial" w:hAnsi="Arial"/>
-          <w:sz w:val="22"/>
-          <w:szCs w:val="22"/>
-        </w:rPr>
-        <w:t xml:space="preserve"/>
-      </w:r>
       <w:r>
         <w:rPr>
           <w:rFonts w:ascii="Arial" w:cs="Arial" w:eastAsia="Arial" w:hAnsi="Arial"/>
@@ -7778,56 +7384,31 @@
     </w:p>
     <w:p>
       <w:pPr>
-        <w:spacing w:after="120" w:line="276"/>
-      </w:pPr>
-      <w:r>
-        <w:rPr>
-          <w:rFonts w:ascii="Arial" w:cs="Arial" w:eastAsia="Arial" w:hAnsi="Arial"/>
-          <w:color w:val="555555"/>
+        <w:keepNext/>
+        <w:spacing w:after="120" w:before="60"/>
+      </w:pPr>
+      <w:hyperlink w:history="1" r:id="rId_espn6m7ev1hmlfeibore">
+        <w:r>
+          <w:rPr>
+            <w:rFonts w:ascii="Arial" w:cs="Arial" w:eastAsia="Arial" w:hAnsi="Arial"/>
+            <w:b/>
+            <w:bCs/>
+            <w:color w:val="0563C1"/>
+            <w:sz w:val="24"/>
+            <w:szCs w:val="24"/>
+            <w:u w:val="single"/>
+          </w:rPr>
+          <w:t xml:space="preserve">▶ Open AP Tests</w:t>
+        </w:r>
+      </w:hyperlink>
+      <w:r>
+        <w:rPr>
+          <w:rFonts w:ascii="Arial" w:cs="Arial" w:eastAsia="Arial" w:hAnsi="Arial"/>
+          <w:color w:val="777777"/>
           <w:sz w:val="18"/>
           <w:szCs w:val="18"/>
         </w:rPr>
-        <w:t xml:space="preserve"/>
-      </w:r>
-      <w:r>
-        <w:rPr>
-          <w:rFonts w:ascii="Arial" w:cs="Arial" w:eastAsia="Arial" w:hAnsi="Arial"/>
-          <w:b/>
-          <w:bCs/>
-          <w:color w:val="555555"/>
-          <w:sz w:val="18"/>
-          <w:szCs w:val="18"/>
-        </w:rPr>
-        <w:t xml:space="preserve">Page name:</w:t>
-      </w:r>
-      <w:r>
-        <w:rPr>
-          <w:rFonts w:ascii="Arial" w:cs="Arial" w:eastAsia="Arial" w:hAnsi="Arial"/>
-          <w:color w:val="555555"/>
-          <w:sz w:val="18"/>
-          <w:szCs w:val="18"/>
-        </w:rPr>
-        <w:t xml:space="preserve"> AP Tests.html   </w:t>
-      </w:r>
-      <w:r>
-        <w:rPr>
-          <w:rFonts w:ascii="Arial" w:cs="Arial" w:eastAsia="Arial" w:hAnsi="Arial"/>
-          <w:b/>
-          <w:bCs/>
-          <w:color w:val="555555"/>
-          <w:sz w:val="18"/>
-          <w:szCs w:val="18"/>
-        </w:rPr>
-        <w:t xml:space="preserve">Link:</w:t>
-      </w:r>
-      <w:r>
-        <w:rPr>
-          <w:rFonts w:ascii="Arial" w:cs="Arial" w:eastAsia="Arial" w:hAnsi="Arial"/>
-          <w:color w:val="555555"/>
-          <w:sz w:val="18"/>
-          <w:szCs w:val="18"/>
-        </w:rPr>
-        <w:t xml:space="preserve"> https://apowles.github.io/AP/AP%20Tests.html</w:t>
+        <w:t xml:space="preserve">   (opens the app in your browser)</w:t>
       </w:r>
     </w:p>
     <w:p>
@@ -7927,14 +7508,6 @@
       <w:r>
         <w:rPr>
           <w:rFonts w:ascii="Arial" w:cs="Arial" w:eastAsia="Arial" w:hAnsi="Arial"/>
-          <w:sz w:val="22"/>
-          <w:szCs w:val="22"/>
-        </w:rPr>
-        <w:t xml:space="preserve"/>
-      </w:r>
-      <w:r>
-        <w:rPr>
-          <w:rFonts w:ascii="Arial" w:cs="Arial" w:eastAsia="Arial" w:hAnsi="Arial"/>
           <w:b/>
           <w:bCs/>
           <w:sz w:val="22"/>
@@ -7960,14 +7533,6 @@
         </w:numPr>
         <w:spacing w:after="70" w:line="276"/>
       </w:pPr>
-      <w:r>
-        <w:rPr>
-          <w:rFonts w:ascii="Arial" w:cs="Arial" w:eastAsia="Arial" w:hAnsi="Arial"/>
-          <w:sz w:val="22"/>
-          <w:szCs w:val="22"/>
-        </w:rPr>
-        <w:t xml:space="preserve"/>
-      </w:r>
       <w:r>
         <w:rPr>
           <w:rFonts w:ascii="Arial" w:cs="Arial" w:eastAsia="Arial" w:hAnsi="Arial"/>
@@ -8301,14 +7866,6 @@
             <w:r>
               <w:rPr>
                 <w:rFonts w:ascii="Arial" w:cs="Arial" w:eastAsia="Arial" w:hAnsi="Arial"/>
-                <w:sz w:val="20"/>
-                <w:szCs w:val="20"/>
-              </w:rPr>
-              <w:t xml:space="preserve"/>
-            </w:r>
-            <w:r>
-              <w:rPr>
-                <w:rFonts w:ascii="Arial" w:cs="Arial" w:eastAsia="Arial" w:hAnsi="Arial"/>
                 <w:b/>
                 <w:bCs/>
                 <w:sz w:val="20"/>
@@ -8385,14 +7942,6 @@
             <w:r>
               <w:rPr>
                 <w:rFonts w:ascii="Arial" w:cs="Arial" w:eastAsia="Arial" w:hAnsi="Arial"/>
-                <w:sz w:val="20"/>
-                <w:szCs w:val="20"/>
-              </w:rPr>
-              <w:t xml:space="preserve"/>
-            </w:r>
-            <w:r>
-              <w:rPr>
-                <w:rFonts w:ascii="Arial" w:cs="Arial" w:eastAsia="Arial" w:hAnsi="Arial"/>
                 <w:b/>
                 <w:bCs/>
                 <w:sz w:val="20"/>
@@ -8487,14 +8036,6 @@
             <w:r>
               <w:rPr>
                 <w:rFonts w:ascii="Arial" w:cs="Arial" w:eastAsia="Arial" w:hAnsi="Arial"/>
-                <w:sz w:val="20"/>
-                <w:szCs w:val="20"/>
-              </w:rPr>
-              <w:t xml:space="preserve"/>
-            </w:r>
-            <w:r>
-              <w:rPr>
-                <w:rFonts w:ascii="Arial" w:cs="Arial" w:eastAsia="Arial" w:hAnsi="Arial"/>
                 <w:b/>
                 <w:bCs/>
                 <w:sz w:val="20"/>
@@ -8519,14 +8060,6 @@
                 <w:szCs w:val="20"/>
               </w:rPr>
               <w:t xml:space="preserve">CLI…</w:t>
-            </w:r>
-            <w:r>
-              <w:rPr>
-                <w:rFonts w:ascii="Arial" w:cs="Arial" w:eastAsia="Arial" w:hAnsi="Arial"/>
-                <w:sz w:val="20"/>
-                <w:szCs w:val="20"/>
-              </w:rPr>
-              <w:t xml:space="preserve"/>
             </w:r>
           </w:p>
         </w:tc>
@@ -8607,28 +8140,12 @@
             <w:r>
               <w:rPr>
                 <w:rFonts w:ascii="Arial" w:cs="Arial" w:eastAsia="Arial" w:hAnsi="Arial"/>
-                <w:sz w:val="20"/>
-                <w:szCs w:val="20"/>
-              </w:rPr>
-              <w:t xml:space="preserve"/>
-            </w:r>
-            <w:r>
-              <w:rPr>
-                <w:rFonts w:ascii="Arial" w:cs="Arial" w:eastAsia="Arial" w:hAnsi="Arial"/>
                 <w:b/>
                 <w:bCs/>
                 <w:sz w:val="20"/>
                 <w:szCs w:val="20"/>
               </w:rPr>
               <w:t xml:space="preserve">RTF…</w:t>
-            </w:r>
-            <w:r>
-              <w:rPr>
-                <w:rFonts w:ascii="Arial" w:cs="Arial" w:eastAsia="Arial" w:hAnsi="Arial"/>
-                <w:sz w:val="20"/>
-                <w:szCs w:val="20"/>
-              </w:rPr>
-              <w:t xml:space="preserve"/>
             </w:r>
           </w:p>
         </w:tc>
@@ -8709,28 +8226,12 @@
             <w:r>
               <w:rPr>
                 <w:rFonts w:ascii="Arial" w:cs="Arial" w:eastAsia="Arial" w:hAnsi="Arial"/>
-                <w:sz w:val="20"/>
-                <w:szCs w:val="20"/>
-              </w:rPr>
-              <w:t xml:space="preserve"/>
-            </w:r>
-            <w:r>
-              <w:rPr>
-                <w:rFonts w:ascii="Arial" w:cs="Arial" w:eastAsia="Arial" w:hAnsi="Arial"/>
                 <w:b/>
                 <w:bCs/>
                 <w:sz w:val="20"/>
                 <w:szCs w:val="20"/>
               </w:rPr>
               <w:t xml:space="preserve">ORF…, ORS…, ORI…</w:t>
-            </w:r>
-            <w:r>
-              <w:rPr>
-                <w:rFonts w:ascii="Arial" w:cs="Arial" w:eastAsia="Arial" w:hAnsi="Arial"/>
-                <w:sz w:val="20"/>
-                <w:szCs w:val="20"/>
-              </w:rPr>
-              <w:t xml:space="preserve"/>
             </w:r>
           </w:p>
         </w:tc>
@@ -8808,14 +8309,6 @@
             <w:pPr>
               <w:spacing w:after="30"/>
             </w:pPr>
-            <w:r>
-              <w:rPr>
-                <w:rFonts w:ascii="Arial" w:cs="Arial" w:eastAsia="Arial" w:hAnsi="Arial"/>
-                <w:sz w:val="20"/>
-                <w:szCs w:val="20"/>
-              </w:rPr>
-              <w:t xml:space="preserve"/>
-            </w:r>
             <w:r>
               <w:rPr>
                 <w:rFonts w:ascii="Arial" w:cs="Arial" w:eastAsia="Arial" w:hAnsi="Arial"/>
@@ -9584,28 +9077,12 @@
             <w:r>
               <w:rPr>
                 <w:rFonts w:ascii="Arial" w:cs="Arial" w:eastAsia="Arial" w:hAnsi="Arial"/>
-                <w:sz w:val="20"/>
-                <w:szCs w:val="20"/>
-              </w:rPr>
-              <w:t xml:space="preserve"/>
-            </w:r>
-            <w:r>
-              <w:rPr>
-                <w:rFonts w:ascii="Arial" w:cs="Arial" w:eastAsia="Arial" w:hAnsi="Arial"/>
                 <w:b/>
                 <w:bCs/>
                 <w:sz w:val="20"/>
                 <w:szCs w:val="20"/>
               </w:rPr>
               <w:t xml:space="preserve">AP A Level French Oral Topics &amp; Paper 1 Practice</w:t>
-            </w:r>
-            <w:r>
-              <w:rPr>
-                <w:rFonts w:ascii="Arial" w:cs="Arial" w:eastAsia="Arial" w:hAnsi="Arial"/>
-                <w:sz w:val="20"/>
-                <w:szCs w:val="20"/>
-              </w:rPr>
-              <w:t xml:space="preserve"/>
             </w:r>
           </w:p>
         </w:tc>
@@ -9698,28 +9175,12 @@
             <w:r>
               <w:rPr>
                 <w:rFonts w:ascii="Arial" w:cs="Arial" w:eastAsia="Arial" w:hAnsi="Arial"/>
-                <w:sz w:val="20"/>
-                <w:szCs w:val="20"/>
-              </w:rPr>
-              <w:t xml:space="preserve"/>
-            </w:r>
-            <w:r>
-              <w:rPr>
-                <w:rFonts w:ascii="Arial" w:cs="Arial" w:eastAsia="Arial" w:hAnsi="Arial"/>
                 <w:b/>
                 <w:bCs/>
                 <w:sz w:val="20"/>
                 <w:szCs w:val="20"/>
               </w:rPr>
               <w:t xml:space="preserve">AP A Level French VVs &amp; Gr EWs &amp; Grammar Translation Practice and Drills</w:t>
-            </w:r>
-            <w:r>
-              <w:rPr>
-                <w:rFonts w:ascii="Arial" w:cs="Arial" w:eastAsia="Arial" w:hAnsi="Arial"/>
-                <w:sz w:val="20"/>
-                <w:szCs w:val="20"/>
-              </w:rPr>
-              <w:t xml:space="preserve"/>
             </w:r>
           </w:p>
         </w:tc>
@@ -9813,28 +9274,12 @@
             <w:r>
               <w:rPr>
                 <w:rFonts w:ascii="Arial" w:cs="Arial" w:eastAsia="Arial" w:hAnsi="Arial"/>
-                <w:sz w:val="20"/>
-                <w:szCs w:val="20"/>
-              </w:rPr>
-              <w:t xml:space="preserve"/>
-            </w:r>
-            <w:r>
-              <w:rPr>
-                <w:rFonts w:ascii="Arial" w:cs="Arial" w:eastAsia="Arial" w:hAnsi="Arial"/>
                 <w:b/>
                 <w:bCs/>
                 <w:sz w:val="20"/>
                 <w:szCs w:val="20"/>
               </w:rPr>
               <w:t xml:space="preserve">AP A Level Oral Phrase Bank</w:t>
-            </w:r>
-            <w:r>
-              <w:rPr>
-                <w:rFonts w:ascii="Arial" w:cs="Arial" w:eastAsia="Arial" w:hAnsi="Arial"/>
-                <w:sz w:val="20"/>
-                <w:szCs w:val="20"/>
-              </w:rPr>
-              <w:t xml:space="preserve"/>
             </w:r>
           </w:p>
         </w:tc>
@@ -9943,70 +9388,37 @@
     </w:p>
     <w:p>
       <w:pPr>
-        <w:spacing w:after="120" w:line="276"/>
-      </w:pPr>
-      <w:r>
-        <w:rPr>
-          <w:rFonts w:ascii="Arial" w:cs="Arial" w:eastAsia="Arial" w:hAnsi="Arial"/>
-          <w:color w:val="555555"/>
+        <w:keepNext/>
+        <w:spacing w:after="120" w:before="60"/>
+      </w:pPr>
+      <w:hyperlink w:history="1" r:id="rIdlhfu37ie4whflrkhspcvt">
+        <w:r>
+          <w:rPr>
+            <w:rFonts w:ascii="Arial" w:cs="Arial" w:eastAsia="Arial" w:hAnsi="Arial"/>
+            <w:b/>
+            <w:bCs/>
+            <w:color w:val="0563C1"/>
+            <w:sz w:val="24"/>
+            <w:szCs w:val="24"/>
+            <w:u w:val="single"/>
+          </w:rPr>
+          <w:t xml:space="preserve">▶ Open AP A Level French Oral Topics &amp; Paper 1 Practice</w:t>
+        </w:r>
+      </w:hyperlink>
+      <w:r>
+        <w:rPr>
+          <w:rFonts w:ascii="Arial" w:cs="Arial" w:eastAsia="Arial" w:hAnsi="Arial"/>
+          <w:color w:val="777777"/>
           <w:sz w:val="18"/>
           <w:szCs w:val="18"/>
         </w:rPr>
-        <w:t xml:space="preserve"/>
-      </w:r>
-      <w:r>
-        <w:rPr>
-          <w:rFonts w:ascii="Arial" w:cs="Arial" w:eastAsia="Arial" w:hAnsi="Arial"/>
-          <w:b/>
-          <w:bCs/>
-          <w:color w:val="555555"/>
-          <w:sz w:val="18"/>
-          <w:szCs w:val="18"/>
-        </w:rPr>
-        <w:t xml:space="preserve">Page name:</w:t>
-      </w:r>
-      <w:r>
-        <w:rPr>
-          <w:rFonts w:ascii="Arial" w:cs="Arial" w:eastAsia="Arial" w:hAnsi="Arial"/>
-          <w:color w:val="555555"/>
-          <w:sz w:val="18"/>
-          <w:szCs w:val="18"/>
-        </w:rPr>
-        <w:t xml:space="preserve"> AP A Level French Oral Topics &amp; Paper 1 Practice.html   </w:t>
-      </w:r>
-      <w:r>
-        <w:rPr>
-          <w:rFonts w:ascii="Arial" w:cs="Arial" w:eastAsia="Arial" w:hAnsi="Arial"/>
-          <w:b/>
-          <w:bCs/>
-          <w:color w:val="555555"/>
-          <w:sz w:val="18"/>
-          <w:szCs w:val="18"/>
-        </w:rPr>
-        <w:t xml:space="preserve">Link:</w:t>
-      </w:r>
-      <w:r>
-        <w:rPr>
-          <w:rFonts w:ascii="Arial" w:cs="Arial" w:eastAsia="Arial" w:hAnsi="Arial"/>
-          <w:color w:val="555555"/>
-          <w:sz w:val="18"/>
-          <w:szCs w:val="18"/>
-        </w:rPr>
-        <w:t xml:space="preserve"> https://apowles.github.io/AP/AP%20A%20Level%20French%20Oral%20Topics%20%26%20Paper%201%20Practice.html</w:t>
+        <w:t xml:space="preserve">   (opens the app in your browser)</w:t>
       </w:r>
     </w:p>
     <w:p>
       <w:pPr>
         <w:spacing w:after="120" w:line="276"/>
       </w:pPr>
-      <w:r>
-        <w:rPr>
-          <w:rFonts w:ascii="Arial" w:cs="Arial" w:eastAsia="Arial" w:hAnsi="Arial"/>
-          <w:sz w:val="22"/>
-          <w:szCs w:val="22"/>
-        </w:rPr>
-        <w:t xml:space="preserve"/>
-      </w:r>
       <w:r>
         <w:rPr>
           <w:rFonts w:ascii="Arial" w:cs="Arial" w:eastAsia="Arial" w:hAnsi="Arial"/>
@@ -10632,14 +10044,6 @@
       <w:r>
         <w:rPr>
           <w:rFonts w:ascii="Arial" w:cs="Arial" w:eastAsia="Arial" w:hAnsi="Arial"/>
-          <w:sz w:val="22"/>
-          <w:szCs w:val="22"/>
-        </w:rPr>
-        <w:t xml:space="preserve"/>
-      </w:r>
-      <w:r>
-        <w:rPr>
-          <w:rFonts w:ascii="Arial" w:cs="Arial" w:eastAsia="Arial" w:hAnsi="Arial"/>
           <w:b/>
           <w:bCs/>
           <w:sz w:val="22"/>
@@ -10776,14 +10180,6 @@
       <w:r>
         <w:rPr>
           <w:rFonts w:ascii="Arial" w:cs="Arial" w:eastAsia="Arial" w:hAnsi="Arial"/>
-          <w:sz w:val="22"/>
-          <w:szCs w:val="22"/>
-        </w:rPr>
-        <w:t xml:space="preserve"/>
-      </w:r>
-      <w:r>
-        <w:rPr>
-          <w:rFonts w:ascii="Arial" w:cs="Arial" w:eastAsia="Arial" w:hAnsi="Arial"/>
           <w:b/>
           <w:bCs/>
           <w:sz w:val="22"/>
@@ -10902,14 +10298,6 @@
       <w:r>
         <w:rPr>
           <w:rFonts w:ascii="Arial" w:cs="Arial" w:eastAsia="Arial" w:hAnsi="Arial"/>
-          <w:sz w:val="22"/>
-          <w:szCs w:val="22"/>
-        </w:rPr>
-        <w:t xml:space="preserve"/>
-      </w:r>
-      <w:r>
-        <w:rPr>
-          <w:rFonts w:ascii="Arial" w:cs="Arial" w:eastAsia="Arial" w:hAnsi="Arial"/>
           <w:b/>
           <w:bCs/>
           <w:sz w:val="22"/>
@@ -10992,14 +10380,6 @@
       <w:r>
         <w:rPr>
           <w:rFonts w:ascii="Arial" w:cs="Arial" w:eastAsia="Arial" w:hAnsi="Arial"/>
-          <w:sz w:val="22"/>
-          <w:szCs w:val="22"/>
-        </w:rPr>
-        <w:t xml:space="preserve"/>
-      </w:r>
-      <w:r>
-        <w:rPr>
-          <w:rFonts w:ascii="Arial" w:cs="Arial" w:eastAsia="Arial" w:hAnsi="Arial"/>
           <w:b/>
           <w:bCs/>
           <w:sz w:val="22"/>
@@ -11223,14 +10603,6 @@
         </w:numPr>
         <w:spacing w:after="60" w:line="276"/>
       </w:pPr>
-      <w:r>
-        <w:rPr>
-          <w:rFonts w:ascii="Arial" w:cs="Arial" w:eastAsia="Arial" w:hAnsi="Arial"/>
-          <w:sz w:val="22"/>
-          <w:szCs w:val="22"/>
-        </w:rPr>
-        <w:t xml:space="preserve"/>
-      </w:r>
       <w:r>
         <w:rPr>
           <w:rFonts w:ascii="Arial" w:cs="Arial" w:eastAsia="Arial" w:hAnsi="Arial"/>
@@ -11474,28 +10846,12 @@
             <w:r>
               <w:rPr>
                 <w:rFonts w:ascii="Arial" w:cs="Arial" w:eastAsia="Arial" w:hAnsi="Arial"/>
-                <w:sz w:val="20"/>
-                <w:szCs w:val="20"/>
-              </w:rPr>
-              <w:t xml:space="preserve"/>
-            </w:r>
-            <w:r>
-              <w:rPr>
-                <w:rFonts w:ascii="Arial" w:cs="Arial" w:eastAsia="Arial" w:hAnsi="Arial"/>
                 <w:b/>
                 <w:bCs/>
                 <w:sz w:val="20"/>
                 <w:szCs w:val="20"/>
               </w:rPr>
               <w:t xml:space="preserve">Comprendre · Understand</w:t>
-            </w:r>
-            <w:r>
-              <w:rPr>
-                <w:rFonts w:ascii="Arial" w:cs="Arial" w:eastAsia="Arial" w:hAnsi="Arial"/>
-                <w:sz w:val="20"/>
-                <w:szCs w:val="20"/>
-              </w:rPr>
-              <w:t xml:space="preserve"/>
             </w:r>
           </w:p>
         </w:tc>
@@ -11612,28 +10968,12 @@
             <w:r>
               <w:rPr>
                 <w:rFonts w:ascii="Arial" w:cs="Arial" w:eastAsia="Arial" w:hAnsi="Arial"/>
-                <w:sz w:val="20"/>
-                <w:szCs w:val="20"/>
-              </w:rPr>
-              <w:t xml:space="preserve"/>
-            </w:r>
-            <w:r>
-              <w:rPr>
-                <w:rFonts w:ascii="Arial" w:cs="Arial" w:eastAsia="Arial" w:hAnsi="Arial"/>
                 <w:b/>
                 <w:bCs/>
                 <w:sz w:val="20"/>
                 <w:szCs w:val="20"/>
               </w:rPr>
               <w:t xml:space="preserve">Les mots · Words</w:t>
-            </w:r>
-            <w:r>
-              <w:rPr>
-                <w:rFonts w:ascii="Arial" w:cs="Arial" w:eastAsia="Arial" w:hAnsi="Arial"/>
-                <w:sz w:val="20"/>
-                <w:szCs w:val="20"/>
-              </w:rPr>
-              <w:t xml:space="preserve"/>
             </w:r>
           </w:p>
         </w:tc>
@@ -11714,14 +11054,6 @@
             <w:r>
               <w:rPr>
                 <w:rFonts w:ascii="Arial" w:cs="Arial" w:eastAsia="Arial" w:hAnsi="Arial"/>
-                <w:sz w:val="20"/>
-                <w:szCs w:val="20"/>
-              </w:rPr>
-              <w:t xml:space="preserve"/>
-            </w:r>
-            <w:r>
-              <w:rPr>
-                <w:rFonts w:ascii="Arial" w:cs="Arial" w:eastAsia="Arial" w:hAnsi="Arial"/>
                 <w:b/>
                 <w:bCs/>
                 <w:sz w:val="20"/>
@@ -11729,14 +11061,6 @@
               </w:rPr>
               <w:t xml:space="preserve">Dire · Say it</w:t>
             </w:r>
-            <w:r>
-              <w:rPr>
-                <w:rFonts w:ascii="Arial" w:cs="Arial" w:eastAsia="Arial" w:hAnsi="Arial"/>
-                <w:sz w:val="20"/>
-                <w:szCs w:val="20"/>
-              </w:rPr>
-              <w:t xml:space="preserve"/>
-            </w:r>
           </w:p>
         </w:tc>
         <w:tc>
@@ -11772,14 +11096,6 @@
             <w:pPr>
               <w:spacing w:after="30"/>
             </w:pPr>
-            <w:r>
-              <w:rPr>
-                <w:rFonts w:ascii="Arial" w:cs="Arial" w:eastAsia="Arial" w:hAnsi="Arial"/>
-                <w:sz w:val="20"/>
-                <w:szCs w:val="20"/>
-              </w:rPr>
-              <w:t xml:space="preserve"/>
-            </w:r>
             <w:r>
               <w:rPr>
                 <w:rFonts w:ascii="Arial" w:cs="Arial" w:eastAsia="Arial" w:hAnsi="Arial"/>
@@ -11824,14 +11140,6 @@
             <w:r>
               <w:rPr>
                 <w:rFonts w:ascii="Arial" w:cs="Arial" w:eastAsia="Arial" w:hAnsi="Arial"/>
-                <w:sz w:val="20"/>
-                <w:szCs w:val="20"/>
-              </w:rPr>
-              <w:t xml:space="preserve"/>
-            </w:r>
-            <w:r>
-              <w:rPr>
-                <w:rFonts w:ascii="Arial" w:cs="Arial" w:eastAsia="Arial" w:hAnsi="Arial"/>
                 <w:b/>
                 <w:bCs/>
                 <w:sz w:val="20"/>
@@ -11873,14 +11181,6 @@
             <w:r>
               <w:rPr>
                 <w:rFonts w:ascii="Arial" w:cs="Arial" w:eastAsia="Arial" w:hAnsi="Arial"/>
-                <w:sz w:val="20"/>
-                <w:szCs w:val="20"/>
-              </w:rPr>
-              <w:t xml:space="preserve"/>
-            </w:r>
-            <w:r>
-              <w:rPr>
-                <w:rFonts w:ascii="Arial" w:cs="Arial" w:eastAsia="Arial" w:hAnsi="Arial"/>
                 <w:b/>
                 <w:bCs/>
                 <w:sz w:val="20"/>
@@ -11937,14 +11237,6 @@
             <w:pPr>
               <w:spacing w:after="30"/>
             </w:pPr>
-            <w:r>
-              <w:rPr>
-                <w:rFonts w:ascii="Arial" w:cs="Arial" w:eastAsia="Arial" w:hAnsi="Arial"/>
-                <w:sz w:val="20"/>
-                <w:szCs w:val="20"/>
-              </w:rPr>
-              <w:t xml:space="preserve"/>
-            </w:r>
             <w:r>
               <w:rPr>
                 <w:rFonts w:ascii="Arial" w:cs="Arial" w:eastAsia="Arial" w:hAnsi="Arial"/>
@@ -12079,28 +11371,12 @@
             <w:r>
               <w:rPr>
                 <w:rFonts w:ascii="Arial" w:cs="Arial" w:eastAsia="Arial" w:hAnsi="Arial"/>
-                <w:sz w:val="20"/>
-                <w:szCs w:val="20"/>
-              </w:rPr>
-              <w:t xml:space="preserve"/>
-            </w:r>
-            <w:r>
-              <w:rPr>
-                <w:rFonts w:ascii="Arial" w:cs="Arial" w:eastAsia="Arial" w:hAnsi="Arial"/>
                 <w:b/>
                 <w:bCs/>
                 <w:sz w:val="20"/>
                 <w:szCs w:val="20"/>
               </w:rPr>
               <w:t xml:space="preserve">Utiliser · Use it</w:t>
-            </w:r>
-            <w:r>
-              <w:rPr>
-                <w:rFonts w:ascii="Arial" w:cs="Arial" w:eastAsia="Arial" w:hAnsi="Arial"/>
-                <w:sz w:val="20"/>
-                <w:szCs w:val="20"/>
-              </w:rPr>
-              <w:t xml:space="preserve"/>
             </w:r>
           </w:p>
         </w:tc>
@@ -12235,28 +11511,12 @@
             <w:r>
               <w:rPr>
                 <w:rFonts w:ascii="Arial" w:cs="Arial" w:eastAsia="Arial" w:hAnsi="Arial"/>
-                <w:sz w:val="20"/>
-                <w:szCs w:val="20"/>
-              </w:rPr>
-              <w:t xml:space="preserve"/>
-            </w:r>
-            <w:r>
-              <w:rPr>
-                <w:rFonts w:ascii="Arial" w:cs="Arial" w:eastAsia="Arial" w:hAnsi="Arial"/>
                 <w:b/>
                 <w:bCs/>
                 <w:sz w:val="20"/>
                 <w:szCs w:val="20"/>
               </w:rPr>
               <w:t xml:space="preserve">Les repères · Final checklist</w:t>
-            </w:r>
-            <w:r>
-              <w:rPr>
-                <w:rFonts w:ascii="Arial" w:cs="Arial" w:eastAsia="Arial" w:hAnsi="Arial"/>
-                <w:sz w:val="20"/>
-                <w:szCs w:val="20"/>
-              </w:rPr>
-              <w:t xml:space="preserve"/>
             </w:r>
           </w:p>
         </w:tc>
@@ -12412,14 +11672,6 @@
       <w:r>
         <w:rPr>
           <w:rFonts w:ascii="Arial" w:cs="Arial" w:eastAsia="Arial" w:hAnsi="Arial"/>
-          <w:sz w:val="22"/>
-          <w:szCs w:val="22"/>
-        </w:rPr>
-        <w:t xml:space="preserve"/>
-      </w:r>
-      <w:r>
-        <w:rPr>
-          <w:rFonts w:ascii="Arial" w:cs="Arial" w:eastAsia="Arial" w:hAnsi="Arial"/>
           <w:b/>
           <w:bCs/>
           <w:sz w:val="22"/>
@@ -12445,14 +11697,6 @@
         </w:numPr>
         <w:spacing w:after="60" w:line="276"/>
       </w:pPr>
-      <w:r>
-        <w:rPr>
-          <w:rFonts w:ascii="Arial" w:cs="Arial" w:eastAsia="Arial" w:hAnsi="Arial"/>
-          <w:sz w:val="22"/>
-          <w:szCs w:val="22"/>
-        </w:rPr>
-        <w:t xml:space="preserve"/>
-      </w:r>
       <w:r>
         <w:rPr>
           <w:rFonts w:ascii="Arial" w:cs="Arial" w:eastAsia="Arial" w:hAnsi="Arial"/>
@@ -12691,14 +11935,6 @@
       <w:r>
         <w:rPr>
           <w:rFonts w:ascii="Arial" w:cs="Arial" w:eastAsia="Arial" w:hAnsi="Arial"/>
-          <w:sz w:val="22"/>
-          <w:szCs w:val="22"/>
-        </w:rPr>
-        <w:t xml:space="preserve"/>
-      </w:r>
-      <w:r>
-        <w:rPr>
-          <w:rFonts w:ascii="Arial" w:cs="Arial" w:eastAsia="Arial" w:hAnsi="Arial"/>
           <w:b/>
           <w:bCs/>
           <w:sz w:val="22"/>
@@ -12745,14 +11981,6 @@
       <w:r>
         <w:rPr>
           <w:rFonts w:ascii="Arial" w:cs="Arial" w:eastAsia="Arial" w:hAnsi="Arial"/>
-          <w:sz w:val="22"/>
-          <w:szCs w:val="22"/>
-        </w:rPr>
-        <w:t xml:space="preserve"/>
-      </w:r>
-      <w:r>
-        <w:rPr>
-          <w:rFonts w:ascii="Arial" w:cs="Arial" w:eastAsia="Arial" w:hAnsi="Arial"/>
           <w:b/>
           <w:bCs/>
           <w:sz w:val="22"/>
@@ -12925,14 +12153,6 @@
       <w:r>
         <w:rPr>
           <w:rFonts w:ascii="Arial" w:cs="Arial" w:eastAsia="Arial" w:hAnsi="Arial"/>
-          <w:sz w:val="22"/>
-          <w:szCs w:val="22"/>
-        </w:rPr>
-        <w:t xml:space="preserve"/>
-      </w:r>
-      <w:r>
-        <w:rPr>
-          <w:rFonts w:ascii="Arial" w:cs="Arial" w:eastAsia="Arial" w:hAnsi="Arial"/>
           <w:b/>
           <w:bCs/>
           <w:sz w:val="22"/>
@@ -13432,14 +12652,6 @@
       <w:r>
         <w:rPr>
           <w:rFonts w:ascii="Arial" w:cs="Arial" w:eastAsia="Arial" w:hAnsi="Arial"/>
-          <w:sz w:val="22"/>
-          <w:szCs w:val="22"/>
-        </w:rPr>
-        <w:t xml:space="preserve"/>
-      </w:r>
-      <w:r>
-        <w:rPr>
-          <w:rFonts w:ascii="Arial" w:cs="Arial" w:eastAsia="Arial" w:hAnsi="Arial"/>
           <w:b/>
           <w:bCs/>
           <w:sz w:val="22"/>
@@ -13681,14 +12893,6 @@
         </w:rPr>
         <w:t xml:space="preserve">Tap A or B to choose your declaration.</w:t>
       </w:r>
-      <w:r>
-        <w:rPr>
-          <w:rFonts w:ascii="Arial" w:cs="Arial" w:eastAsia="Arial" w:hAnsi="Arial"/>
-          <w:sz w:val="22"/>
-          <w:szCs w:val="22"/>
-        </w:rPr>
-        <w:t xml:space="preserve"/>
-      </w:r>
     </w:p>
     <w:p>
       <w:pPr>
@@ -13828,14 +13032,6 @@
       <w:r>
         <w:rPr>
           <w:rFonts w:ascii="Arial" w:cs="Arial" w:eastAsia="Arial" w:hAnsi="Arial"/>
-          <w:sz w:val="22"/>
-          <w:szCs w:val="22"/>
-        </w:rPr>
-        <w:t xml:space="preserve"/>
-      </w:r>
-      <w:r>
-        <w:rPr>
-          <w:rFonts w:ascii="Arial" w:cs="Arial" w:eastAsia="Arial" w:hAnsi="Arial"/>
           <w:b/>
           <w:bCs/>
           <w:sz w:val="22"/>
@@ -13972,14 +13168,6 @@
       <w:r>
         <w:rPr>
           <w:rFonts w:ascii="Arial" w:cs="Arial" w:eastAsia="Arial" w:hAnsi="Arial"/>
-          <w:sz w:val="22"/>
-          <w:szCs w:val="22"/>
-        </w:rPr>
-        <w:t xml:space="preserve"/>
-      </w:r>
-      <w:r>
-        <w:rPr>
-          <w:rFonts w:ascii="Arial" w:cs="Arial" w:eastAsia="Arial" w:hAnsi="Arial"/>
           <w:b/>
           <w:bCs/>
           <w:sz w:val="22"/>
@@ -14077,14 +13265,6 @@
         </w:numPr>
         <w:spacing w:after="60" w:line="276"/>
       </w:pPr>
-      <w:r>
-        <w:rPr>
-          <w:rFonts w:ascii="Arial" w:cs="Arial" w:eastAsia="Arial" w:hAnsi="Arial"/>
-          <w:sz w:val="22"/>
-          <w:szCs w:val="22"/>
-        </w:rPr>
-        <w:t xml:space="preserve"/>
-      </w:r>
       <w:r>
         <w:rPr>
           <w:rFonts w:ascii="Arial" w:cs="Arial" w:eastAsia="Arial" w:hAnsi="Arial"/>
@@ -16472,14 +15652,6 @@
       <w:r>
         <w:rPr>
           <w:rFonts w:ascii="Arial" w:cs="Arial" w:eastAsia="Arial" w:hAnsi="Arial"/>
-          <w:sz w:val="22"/>
-          <w:szCs w:val="22"/>
-        </w:rPr>
-        <w:t xml:space="preserve"/>
-      </w:r>
-      <w:r>
-        <w:rPr>
-          <w:rFonts w:ascii="Arial" w:cs="Arial" w:eastAsia="Arial" w:hAnsi="Arial"/>
           <w:b/>
           <w:bCs/>
           <w:sz w:val="22"/>
@@ -16873,14 +16045,6 @@
       <w:pPr>
         <w:spacing w:after="120" w:line="276"/>
       </w:pPr>
-      <w:r>
-        <w:rPr>
-          <w:rFonts w:ascii="Arial" w:cs="Arial" w:eastAsia="Arial" w:hAnsi="Arial"/>
-          <w:sz w:val="22"/>
-          <w:szCs w:val="22"/>
-        </w:rPr>
-        <w:t xml:space="preserve"/>
-      </w:r>
       <w:r>
         <w:rPr>
           <w:rFonts w:ascii="Arial" w:cs="Arial" w:eastAsia="Arial" w:hAnsi="Arial"/>
@@ -17063,17 +16227,6 @@
             <w:pPr>
               <w:spacing w:after="30"/>
             </w:pPr>
-            <w:r>
-              <w:rPr>
-                <w:rFonts w:ascii="Arial" w:cs="Arial" w:eastAsia="Arial" w:hAnsi="Arial"/>
-                <w:b/>
-                <w:bCs/>
-                <w:color w:val="FFFFFF"/>
-                <w:sz w:val="20"/>
-                <w:szCs w:val="20"/>
-              </w:rPr>
-              <w:t xml:space="preserve"/>
-            </w:r>
           </w:p>
         </w:tc>
       </w:tr>
@@ -17191,14 +16344,6 @@
             <w:pPr>
               <w:spacing w:after="30"/>
             </w:pPr>
-            <w:r>
-              <w:rPr>
-                <w:rFonts w:ascii="Arial" w:cs="Arial" w:eastAsia="Arial" w:hAnsi="Arial"/>
-                <w:sz w:val="20"/>
-                <w:szCs w:val="20"/>
-              </w:rPr>
-              <w:t xml:space="preserve"/>
-            </w:r>
           </w:p>
         </w:tc>
       </w:tr>
@@ -17320,14 +16465,6 @@
             <w:pPr>
               <w:spacing w:after="30"/>
             </w:pPr>
-            <w:r>
-              <w:rPr>
-                <w:rFonts w:ascii="Arial" w:cs="Arial" w:eastAsia="Arial" w:hAnsi="Arial"/>
-                <w:sz w:val="20"/>
-                <w:szCs w:val="20"/>
-              </w:rPr>
-              <w:t xml:space="preserve"/>
-            </w:r>
           </w:p>
         </w:tc>
       </w:tr>
@@ -17445,14 +16582,6 @@
             <w:pPr>
               <w:spacing w:after="30"/>
             </w:pPr>
-            <w:r>
-              <w:rPr>
-                <w:rFonts w:ascii="Arial" w:cs="Arial" w:eastAsia="Arial" w:hAnsi="Arial"/>
-                <w:sz w:val="20"/>
-                <w:szCs w:val="20"/>
-              </w:rPr>
-              <w:t xml:space="preserve"/>
-            </w:r>
           </w:p>
         </w:tc>
       </w:tr>
@@ -17574,14 +16703,6 @@
             <w:pPr>
               <w:spacing w:after="30"/>
             </w:pPr>
-            <w:r>
-              <w:rPr>
-                <w:rFonts w:ascii="Arial" w:cs="Arial" w:eastAsia="Arial" w:hAnsi="Arial"/>
-                <w:sz w:val="20"/>
-                <w:szCs w:val="20"/>
-              </w:rPr>
-              <w:t xml:space="preserve"/>
-            </w:r>
           </w:p>
         </w:tc>
       </w:tr>
@@ -17699,14 +16820,6 @@
             <w:pPr>
               <w:spacing w:after="30"/>
             </w:pPr>
-            <w:r>
-              <w:rPr>
-                <w:rFonts w:ascii="Arial" w:cs="Arial" w:eastAsia="Arial" w:hAnsi="Arial"/>
-                <w:sz w:val="20"/>
-                <w:szCs w:val="20"/>
-              </w:rPr>
-              <w:t xml:space="preserve"/>
-            </w:r>
           </w:p>
         </w:tc>
       </w:tr>
@@ -17828,14 +16941,6 @@
             <w:pPr>
               <w:spacing w:after="30"/>
             </w:pPr>
-            <w:r>
-              <w:rPr>
-                <w:rFonts w:ascii="Arial" w:cs="Arial" w:eastAsia="Arial" w:hAnsi="Arial"/>
-                <w:sz w:val="20"/>
-                <w:szCs w:val="20"/>
-              </w:rPr>
-              <w:t xml:space="preserve"/>
-            </w:r>
           </w:p>
         </w:tc>
       </w:tr>
@@ -17953,14 +17058,6 @@
             <w:pPr>
               <w:spacing w:after="30"/>
             </w:pPr>
-            <w:r>
-              <w:rPr>
-                <w:rFonts w:ascii="Arial" w:cs="Arial" w:eastAsia="Arial" w:hAnsi="Arial"/>
-                <w:sz w:val="20"/>
-                <w:szCs w:val="20"/>
-              </w:rPr>
-              <w:t xml:space="preserve"/>
-            </w:r>
           </w:p>
         </w:tc>
       </w:tr>
@@ -18082,14 +17179,6 @@
             <w:pPr>
               <w:spacing w:after="30"/>
             </w:pPr>
-            <w:r>
-              <w:rPr>
-                <w:rFonts w:ascii="Arial" w:cs="Arial" w:eastAsia="Arial" w:hAnsi="Arial"/>
-                <w:sz w:val="20"/>
-                <w:szCs w:val="20"/>
-              </w:rPr>
-              <w:t xml:space="preserve"/>
-            </w:r>
           </w:p>
         </w:tc>
       </w:tr>
@@ -18207,14 +17296,6 @@
             <w:pPr>
               <w:spacing w:after="30"/>
             </w:pPr>
-            <w:r>
-              <w:rPr>
-                <w:rFonts w:ascii="Arial" w:cs="Arial" w:eastAsia="Arial" w:hAnsi="Arial"/>
-                <w:sz w:val="20"/>
-                <w:szCs w:val="20"/>
-              </w:rPr>
-              <w:t xml:space="preserve"/>
-            </w:r>
           </w:p>
         </w:tc>
       </w:tr>
@@ -18236,14 +17317,6 @@
       <w:r>
         <w:rPr>
           <w:rFonts w:ascii="Arial" w:cs="Arial" w:eastAsia="Arial" w:hAnsi="Arial"/>
-          <w:sz w:val="22"/>
-          <w:szCs w:val="22"/>
-        </w:rPr>
-        <w:t xml:space="preserve"/>
-      </w:r>
-      <w:r>
-        <w:rPr>
-          <w:rFonts w:ascii="Arial" w:cs="Arial" w:eastAsia="Arial" w:hAnsi="Arial"/>
           <w:b/>
           <w:bCs/>
           <w:sz w:val="22"/>
@@ -18442,70 +17515,37 @@
     </w:p>
     <w:p>
       <w:pPr>
-        <w:spacing w:after="120" w:line="276"/>
-      </w:pPr>
-      <w:r>
-        <w:rPr>
-          <w:rFonts w:ascii="Arial" w:cs="Arial" w:eastAsia="Arial" w:hAnsi="Arial"/>
-          <w:color w:val="555555"/>
+        <w:keepNext/>
+        <w:spacing w:after="120" w:before="60"/>
+      </w:pPr>
+      <w:hyperlink w:history="1" r:id="rIduodvosnn5vhufaijc3g26">
+        <w:r>
+          <w:rPr>
+            <w:rFonts w:ascii="Arial" w:cs="Arial" w:eastAsia="Arial" w:hAnsi="Arial"/>
+            <w:b/>
+            <w:bCs/>
+            <w:color w:val="0563C1"/>
+            <w:sz w:val="24"/>
+            <w:szCs w:val="24"/>
+            <w:u w:val="single"/>
+          </w:rPr>
+          <w:t xml:space="preserve">▶ Open AP A Level French VVs &amp; Gr EWs &amp; Grammar Translation Practice and Drills</w:t>
+        </w:r>
+      </w:hyperlink>
+      <w:r>
+        <w:rPr>
+          <w:rFonts w:ascii="Arial" w:cs="Arial" w:eastAsia="Arial" w:hAnsi="Arial"/>
+          <w:color w:val="777777"/>
           <w:sz w:val="18"/>
           <w:szCs w:val="18"/>
         </w:rPr>
-        <w:t xml:space="preserve"/>
-      </w:r>
-      <w:r>
-        <w:rPr>
-          <w:rFonts w:ascii="Arial" w:cs="Arial" w:eastAsia="Arial" w:hAnsi="Arial"/>
-          <w:b/>
-          <w:bCs/>
-          <w:color w:val="555555"/>
-          <w:sz w:val="18"/>
-          <w:szCs w:val="18"/>
-        </w:rPr>
-        <w:t xml:space="preserve">Page name:</w:t>
-      </w:r>
-      <w:r>
-        <w:rPr>
-          <w:rFonts w:ascii="Arial" w:cs="Arial" w:eastAsia="Arial" w:hAnsi="Arial"/>
-          <w:color w:val="555555"/>
-          <w:sz w:val="18"/>
-          <w:szCs w:val="18"/>
-        </w:rPr>
-        <w:t xml:space="preserve"> AP A Level French VVs &amp; Gr EWs &amp; Grammar Translation Practice and Drills.html   </w:t>
-      </w:r>
-      <w:r>
-        <w:rPr>
-          <w:rFonts w:ascii="Arial" w:cs="Arial" w:eastAsia="Arial" w:hAnsi="Arial"/>
-          <w:b/>
-          <w:bCs/>
-          <w:color w:val="555555"/>
-          <w:sz w:val="18"/>
-          <w:szCs w:val="18"/>
-        </w:rPr>
-        <w:t xml:space="preserve">Link:</w:t>
-      </w:r>
-      <w:r>
-        <w:rPr>
-          <w:rFonts w:ascii="Arial" w:cs="Arial" w:eastAsia="Arial" w:hAnsi="Arial"/>
-          <w:color w:val="555555"/>
-          <w:sz w:val="18"/>
-          <w:szCs w:val="18"/>
-        </w:rPr>
-        <w:t xml:space="preserve"> https://apowles.github.io/AP/AP%20A%20Level%20French%20VVs%20%26%20Gr%20EWs%20%26%20Grammar%20Translation%20Practice%20and%20Drills.html</w:t>
+        <w:t xml:space="preserve">   (opens the app in your browser)</w:t>
       </w:r>
     </w:p>
     <w:p>
       <w:pPr>
         <w:spacing w:after="120" w:line="276"/>
       </w:pPr>
-      <w:r>
-        <w:rPr>
-          <w:rFonts w:ascii="Arial" w:cs="Arial" w:eastAsia="Arial" w:hAnsi="Arial"/>
-          <w:sz w:val="22"/>
-          <w:szCs w:val="22"/>
-        </w:rPr>
-        <w:t xml:space="preserve"/>
-      </w:r>
       <w:r>
         <w:rPr>
           <w:rFonts w:ascii="Arial" w:cs="Arial" w:eastAsia="Arial" w:hAnsi="Arial"/>
@@ -18641,28 +17681,12 @@
             <w:r>
               <w:rPr>
                 <w:rFonts w:ascii="Arial" w:cs="Arial" w:eastAsia="Arial" w:hAnsi="Arial"/>
-                <w:sz w:val="20"/>
-                <w:szCs w:val="20"/>
-              </w:rPr>
-              <w:t xml:space="preserve"/>
-            </w:r>
-            <w:r>
-              <w:rPr>
-                <w:rFonts w:ascii="Arial" w:cs="Arial" w:eastAsia="Arial" w:hAnsi="Arial"/>
                 <w:b/>
                 <w:bCs/>
                 <w:sz w:val="20"/>
                 <w:szCs w:val="20"/>
               </w:rPr>
               <w:t xml:space="preserve">📚 VVs Drill</w:t>
-            </w:r>
-            <w:r>
-              <w:rPr>
-                <w:rFonts w:ascii="Arial" w:cs="Arial" w:eastAsia="Arial" w:hAnsi="Arial"/>
-                <w:sz w:val="20"/>
-                <w:szCs w:val="20"/>
-              </w:rPr>
-              <w:t xml:space="preserve"/>
             </w:r>
           </w:p>
         </w:tc>
@@ -18725,28 +17749,12 @@
             <w:r>
               <w:rPr>
                 <w:rFonts w:ascii="Arial" w:cs="Arial" w:eastAsia="Arial" w:hAnsi="Arial"/>
-                <w:sz w:val="20"/>
-                <w:szCs w:val="20"/>
-              </w:rPr>
-              <w:t xml:space="preserve"/>
-            </w:r>
-            <w:r>
-              <w:rPr>
-                <w:rFonts w:ascii="Arial" w:cs="Arial" w:eastAsia="Arial" w:hAnsi="Arial"/>
                 <w:b/>
                 <w:bCs/>
                 <w:sz w:val="20"/>
                 <w:szCs w:val="20"/>
               </w:rPr>
               <w:t xml:space="preserve">📝 VVs Sentence Drill</w:t>
-            </w:r>
-            <w:r>
-              <w:rPr>
-                <w:rFonts w:ascii="Arial" w:cs="Arial" w:eastAsia="Arial" w:hAnsi="Arial"/>
-                <w:sz w:val="20"/>
-                <w:szCs w:val="20"/>
-              </w:rPr>
-              <w:t xml:space="preserve"/>
             </w:r>
           </w:p>
         </w:tc>
@@ -18809,28 +17817,12 @@
             <w:r>
               <w:rPr>
                 <w:rFonts w:ascii="Arial" w:cs="Arial" w:eastAsia="Arial" w:hAnsi="Arial"/>
-                <w:sz w:val="20"/>
-                <w:szCs w:val="20"/>
-              </w:rPr>
-              <w:t xml:space="preserve"/>
-            </w:r>
-            <w:r>
-              <w:rPr>
-                <w:rFonts w:ascii="Arial" w:cs="Arial" w:eastAsia="Arial" w:hAnsi="Arial"/>
                 <w:b/>
                 <w:bCs/>
                 <w:sz w:val="20"/>
                 <w:szCs w:val="20"/>
               </w:rPr>
               <w:t xml:space="preserve">✍️ Translation Practice</w:t>
-            </w:r>
-            <w:r>
-              <w:rPr>
-                <w:rFonts w:ascii="Arial" w:cs="Arial" w:eastAsia="Arial" w:hAnsi="Arial"/>
-                <w:sz w:val="20"/>
-                <w:szCs w:val="20"/>
-              </w:rPr>
-              <w:t xml:space="preserve"/>
             </w:r>
           </w:p>
         </w:tc>
@@ -18893,28 +17885,12 @@
             <w:r>
               <w:rPr>
                 <w:rFonts w:ascii="Arial" w:cs="Arial" w:eastAsia="Arial" w:hAnsi="Arial"/>
-                <w:sz w:val="20"/>
-                <w:szCs w:val="20"/>
-              </w:rPr>
-              <w:t xml:space="preserve"/>
-            </w:r>
-            <w:r>
-              <w:rPr>
-                <w:rFonts w:ascii="Arial" w:cs="Arial" w:eastAsia="Arial" w:hAnsi="Arial"/>
                 <w:b/>
                 <w:bCs/>
                 <w:sz w:val="20"/>
                 <w:szCs w:val="20"/>
               </w:rPr>
               <w:t xml:space="preserve">🎯 Grammar Drills</w:t>
-            </w:r>
-            <w:r>
-              <w:rPr>
-                <w:rFonts w:ascii="Arial" w:cs="Arial" w:eastAsia="Arial" w:hAnsi="Arial"/>
-                <w:sz w:val="20"/>
-                <w:szCs w:val="20"/>
-              </w:rPr>
-              <w:t xml:space="preserve"/>
             </w:r>
           </w:p>
         </w:tc>
@@ -18977,28 +17953,12 @@
             <w:r>
               <w:rPr>
                 <w:rFonts w:ascii="Arial" w:cs="Arial" w:eastAsia="Arial" w:hAnsi="Arial"/>
-                <w:sz w:val="20"/>
-                <w:szCs w:val="20"/>
-              </w:rPr>
-              <w:t xml:space="preserve"/>
-            </w:r>
-            <w:r>
-              <w:rPr>
-                <w:rFonts w:ascii="Arial" w:cs="Arial" w:eastAsia="Arial" w:hAnsi="Arial"/>
                 <w:b/>
                 <w:bCs/>
                 <w:sz w:val="20"/>
                 <w:szCs w:val="20"/>
               </w:rPr>
               <w:t xml:space="preserve">🌐 AP Metalanguage Formulae</w:t>
-            </w:r>
-            <w:r>
-              <w:rPr>
-                <w:rFonts w:ascii="Arial" w:cs="Arial" w:eastAsia="Arial" w:hAnsi="Arial"/>
-                <w:sz w:val="20"/>
-                <w:szCs w:val="20"/>
-              </w:rPr>
-              <w:t xml:space="preserve"/>
             </w:r>
           </w:p>
         </w:tc>
@@ -19061,28 +18021,12 @@
             <w:r>
               <w:rPr>
                 <w:rFonts w:ascii="Arial" w:cs="Arial" w:eastAsia="Arial" w:hAnsi="Arial"/>
-                <w:sz w:val="20"/>
-                <w:szCs w:val="20"/>
-              </w:rPr>
-              <w:t xml:space="preserve"/>
-            </w:r>
-            <w:r>
-              <w:rPr>
-                <w:rFonts w:ascii="Arial" w:cs="Arial" w:eastAsia="Arial" w:hAnsi="Arial"/>
                 <w:b/>
                 <w:bCs/>
                 <w:sz w:val="20"/>
                 <w:szCs w:val="20"/>
               </w:rPr>
               <w:t xml:space="preserve">🏆 Gr EWs</w:t>
-            </w:r>
-            <w:r>
-              <w:rPr>
-                <w:rFonts w:ascii="Arial" w:cs="Arial" w:eastAsia="Arial" w:hAnsi="Arial"/>
-                <w:sz w:val="20"/>
-                <w:szCs w:val="20"/>
-              </w:rPr>
-              <w:t xml:space="preserve"/>
             </w:r>
           </w:p>
         </w:tc>
@@ -19145,28 +18089,12 @@
             <w:r>
               <w:rPr>
                 <w:rFonts w:ascii="Arial" w:cs="Arial" w:eastAsia="Arial" w:hAnsi="Arial"/>
-                <w:sz w:val="20"/>
-                <w:szCs w:val="20"/>
-              </w:rPr>
-              <w:t xml:space="preserve"/>
-            </w:r>
-            <w:r>
-              <w:rPr>
-                <w:rFonts w:ascii="Arial" w:cs="Arial" w:eastAsia="Arial" w:hAnsi="Arial"/>
                 <w:b/>
                 <w:bCs/>
                 <w:sz w:val="20"/>
                 <w:szCs w:val="20"/>
               </w:rPr>
               <w:t xml:space="preserve">⌂ Home</w:t>
-            </w:r>
-            <w:r>
-              <w:rPr>
-                <w:rFonts w:ascii="Arial" w:cs="Arial" w:eastAsia="Arial" w:hAnsi="Arial"/>
-                <w:sz w:val="20"/>
-                <w:szCs w:val="20"/>
-              </w:rPr>
-              <w:t xml:space="preserve"/>
             </w:r>
           </w:p>
         </w:tc>
@@ -19237,14 +18165,6 @@
       <w:r>
         <w:rPr>
           <w:rFonts w:ascii="Arial" w:cs="Arial" w:eastAsia="Arial" w:hAnsi="Arial"/>
-          <w:sz w:val="22"/>
-          <w:szCs w:val="22"/>
-        </w:rPr>
-        <w:t xml:space="preserve"/>
-      </w:r>
-      <w:r>
-        <w:rPr>
-          <w:rFonts w:ascii="Arial" w:cs="Arial" w:eastAsia="Arial" w:hAnsi="Arial"/>
           <w:b/>
           <w:bCs/>
           <w:sz w:val="22"/>
@@ -19453,14 +18373,6 @@
       <w:r>
         <w:rPr>
           <w:rFonts w:ascii="Arial" w:cs="Arial" w:eastAsia="Arial" w:hAnsi="Arial"/>
-          <w:sz w:val="22"/>
-          <w:szCs w:val="22"/>
-        </w:rPr>
-        <w:t xml:space="preserve"/>
-      </w:r>
-      <w:r>
-        <w:rPr>
-          <w:rFonts w:ascii="Arial" w:cs="Arial" w:eastAsia="Arial" w:hAnsi="Arial"/>
           <w:b/>
           <w:bCs/>
           <w:sz w:val="22"/>
@@ -19489,14 +18401,6 @@
       <w:r>
         <w:rPr>
           <w:rFonts w:ascii="Arial" w:cs="Arial" w:eastAsia="Arial" w:hAnsi="Arial"/>
-          <w:sz w:val="22"/>
-          <w:szCs w:val="22"/>
-        </w:rPr>
-        <w:t xml:space="preserve"/>
-      </w:r>
-      <w:r>
-        <w:rPr>
-          <w:rFonts w:ascii="Arial" w:cs="Arial" w:eastAsia="Arial" w:hAnsi="Arial"/>
           <w:b/>
           <w:bCs/>
           <w:sz w:val="22"/>
@@ -19625,14 +18529,6 @@
       <w:pPr>
         <w:spacing w:after="120" w:line="276"/>
       </w:pPr>
-      <w:r>
-        <w:rPr>
-          <w:rFonts w:ascii="Arial" w:cs="Arial" w:eastAsia="Arial" w:hAnsi="Arial"/>
-          <w:sz w:val="22"/>
-          <w:szCs w:val="22"/>
-        </w:rPr>
-        <w:t xml:space="preserve"/>
-      </w:r>
       <w:r>
         <w:rPr>
           <w:rFonts w:ascii="Arial" w:cs="Arial" w:eastAsia="Arial" w:hAnsi="Arial"/>
@@ -19880,14 +18776,6 @@
       <w:r>
         <w:rPr>
           <w:rFonts w:ascii="Arial" w:cs="Arial" w:eastAsia="Arial" w:hAnsi="Arial"/>
-          <w:sz w:val="22"/>
-          <w:szCs w:val="22"/>
-        </w:rPr>
-        <w:t xml:space="preserve"/>
-      </w:r>
-      <w:r>
-        <w:rPr>
-          <w:rFonts w:ascii="Arial" w:cs="Arial" w:eastAsia="Arial" w:hAnsi="Arial"/>
           <w:b/>
           <w:bCs/>
           <w:sz w:val="22"/>
@@ -20078,14 +18966,6 @@
       <w:r>
         <w:rPr>
           <w:rFonts w:ascii="Arial" w:cs="Arial" w:eastAsia="Arial" w:hAnsi="Arial"/>
-          <w:sz w:val="22"/>
-          <w:szCs w:val="22"/>
-        </w:rPr>
-        <w:t xml:space="preserve"/>
-      </w:r>
-      <w:r>
-        <w:rPr>
-          <w:rFonts w:ascii="Arial" w:cs="Arial" w:eastAsia="Arial" w:hAnsi="Arial"/>
           <w:b/>
           <w:bCs/>
           <w:sz w:val="22"/>
@@ -20384,14 +19264,6 @@
       <w:r>
         <w:rPr>
           <w:rFonts w:ascii="Arial" w:cs="Arial" w:eastAsia="Arial" w:hAnsi="Arial"/>
-          <w:sz w:val="22"/>
-          <w:szCs w:val="22"/>
-        </w:rPr>
-        <w:t xml:space="preserve"/>
-      </w:r>
-      <w:r>
-        <w:rPr>
-          <w:rFonts w:ascii="Arial" w:cs="Arial" w:eastAsia="Arial" w:hAnsi="Arial"/>
           <w:b/>
           <w:bCs/>
           <w:sz w:val="22"/>
@@ -20528,14 +19400,6 @@
       <w:r>
         <w:rPr>
           <w:rFonts w:ascii="Arial" w:cs="Arial" w:eastAsia="Arial" w:hAnsi="Arial"/>
-          <w:sz w:val="22"/>
-          <w:szCs w:val="22"/>
-        </w:rPr>
-        <w:t xml:space="preserve"/>
-      </w:r>
-      <w:r>
-        <w:rPr>
-          <w:rFonts w:ascii="Arial" w:cs="Arial" w:eastAsia="Arial" w:hAnsi="Arial"/>
           <w:b/>
           <w:bCs/>
           <w:sz w:val="22"/>
@@ -20564,14 +19428,6 @@
       <w:r>
         <w:rPr>
           <w:rFonts w:ascii="Arial" w:cs="Arial" w:eastAsia="Arial" w:hAnsi="Arial"/>
-          <w:sz w:val="22"/>
-          <w:szCs w:val="22"/>
-        </w:rPr>
-        <w:t xml:space="preserve"/>
-      </w:r>
-      <w:r>
-        <w:rPr>
-          <w:rFonts w:ascii="Arial" w:cs="Arial" w:eastAsia="Arial" w:hAnsi="Arial"/>
           <w:b/>
           <w:bCs/>
           <w:sz w:val="22"/>
@@ -20636,14 +19492,6 @@
       <w:r>
         <w:rPr>
           <w:rFonts w:ascii="Arial" w:cs="Arial" w:eastAsia="Arial" w:hAnsi="Arial"/>
-          <w:sz w:val="22"/>
-          <w:szCs w:val="22"/>
-        </w:rPr>
-        <w:t xml:space="preserve"/>
-      </w:r>
-      <w:r>
-        <w:rPr>
-          <w:rFonts w:ascii="Arial" w:cs="Arial" w:eastAsia="Arial" w:hAnsi="Arial"/>
           <w:b/>
           <w:bCs/>
           <w:sz w:val="22"/>
@@ -20726,14 +19574,6 @@
       <w:r>
         <w:rPr>
           <w:rFonts w:ascii="Arial" w:cs="Arial" w:eastAsia="Arial" w:hAnsi="Arial"/>
-          <w:sz w:val="22"/>
-          <w:szCs w:val="22"/>
-        </w:rPr>
-        <w:t xml:space="preserve"/>
-      </w:r>
-      <w:r>
-        <w:rPr>
-          <w:rFonts w:ascii="Arial" w:cs="Arial" w:eastAsia="Arial" w:hAnsi="Arial"/>
           <w:b/>
           <w:bCs/>
           <w:sz w:val="22"/>
@@ -20798,14 +19638,6 @@
       <w:r>
         <w:rPr>
           <w:rFonts w:ascii="Arial" w:cs="Arial" w:eastAsia="Arial" w:hAnsi="Arial"/>
-          <w:sz w:val="22"/>
-          <w:szCs w:val="22"/>
-        </w:rPr>
-        <w:t xml:space="preserve"/>
-      </w:r>
-      <w:r>
-        <w:rPr>
-          <w:rFonts w:ascii="Arial" w:cs="Arial" w:eastAsia="Arial" w:hAnsi="Arial"/>
           <w:b/>
           <w:bCs/>
           <w:sz w:val="22"/>
@@ -20870,14 +19702,6 @@
       <w:r>
         <w:rPr>
           <w:rFonts w:ascii="Arial" w:cs="Arial" w:eastAsia="Arial" w:hAnsi="Arial"/>
-          <w:sz w:val="22"/>
-          <w:szCs w:val="22"/>
-        </w:rPr>
-        <w:t xml:space="preserve"/>
-      </w:r>
-      <w:r>
-        <w:rPr>
-          <w:rFonts w:ascii="Arial" w:cs="Arial" w:eastAsia="Arial" w:hAnsi="Arial"/>
           <w:b/>
           <w:bCs/>
           <w:sz w:val="22"/>
@@ -20906,14 +19730,6 @@
       <w:r>
         <w:rPr>
           <w:rFonts w:ascii="Arial" w:cs="Arial" w:eastAsia="Arial" w:hAnsi="Arial"/>
-          <w:sz w:val="22"/>
-          <w:szCs w:val="22"/>
-        </w:rPr>
-        <w:t xml:space="preserve"/>
-      </w:r>
-      <w:r>
-        <w:rPr>
-          <w:rFonts w:ascii="Arial" w:cs="Arial" w:eastAsia="Arial" w:hAnsi="Arial"/>
           <w:b/>
           <w:bCs/>
           <w:sz w:val="22"/>
@@ -21173,14 +19989,6 @@
         </w:numPr>
         <w:spacing w:after="60" w:line="276"/>
       </w:pPr>
-      <w:r>
-        <w:rPr>
-          <w:rFonts w:ascii="Arial" w:cs="Arial" w:eastAsia="Arial" w:hAnsi="Arial"/>
-          <w:sz w:val="22"/>
-          <w:szCs w:val="22"/>
-        </w:rPr>
-        <w:t xml:space="preserve"/>
-      </w:r>
       <w:r>
         <w:rPr>
           <w:rFonts w:ascii="Arial" w:cs="Arial" w:eastAsia="Arial" w:hAnsi="Arial"/>
@@ -21499,70 +20307,37 @@
     </w:p>
     <w:p>
       <w:pPr>
-        <w:spacing w:after="120" w:line="276"/>
-      </w:pPr>
-      <w:r>
-        <w:rPr>
-          <w:rFonts w:ascii="Arial" w:cs="Arial" w:eastAsia="Arial" w:hAnsi="Arial"/>
-          <w:color w:val="555555"/>
+        <w:keepNext/>
+        <w:spacing w:after="120" w:before="60"/>
+      </w:pPr>
+      <w:hyperlink w:history="1" r:id="rIds00ud85mrs_qqkekq_kke">
+        <w:r>
+          <w:rPr>
+            <w:rFonts w:ascii="Arial" w:cs="Arial" w:eastAsia="Arial" w:hAnsi="Arial"/>
+            <w:b/>
+            <w:bCs/>
+            <w:color w:val="0563C1"/>
+            <w:sz w:val="24"/>
+            <w:szCs w:val="24"/>
+            <w:u w:val="single"/>
+          </w:rPr>
+          <w:t xml:space="preserve">▶ Open AP A Level Oral Phrase Bank</w:t>
+        </w:r>
+      </w:hyperlink>
+      <w:r>
+        <w:rPr>
+          <w:rFonts w:ascii="Arial" w:cs="Arial" w:eastAsia="Arial" w:hAnsi="Arial"/>
+          <w:color w:val="777777"/>
           <w:sz w:val="18"/>
           <w:szCs w:val="18"/>
         </w:rPr>
-        <w:t xml:space="preserve"/>
-      </w:r>
-      <w:r>
-        <w:rPr>
-          <w:rFonts w:ascii="Arial" w:cs="Arial" w:eastAsia="Arial" w:hAnsi="Arial"/>
-          <w:b/>
-          <w:bCs/>
-          <w:color w:val="555555"/>
-          <w:sz w:val="18"/>
-          <w:szCs w:val="18"/>
-        </w:rPr>
-        <w:t xml:space="preserve">Page name:</w:t>
-      </w:r>
-      <w:r>
-        <w:rPr>
-          <w:rFonts w:ascii="Arial" w:cs="Arial" w:eastAsia="Arial" w:hAnsi="Arial"/>
-          <w:color w:val="555555"/>
-          <w:sz w:val="18"/>
-          <w:szCs w:val="18"/>
-        </w:rPr>
-        <w:t xml:space="preserve"> AP A Level Oral Phrase Bank.html   </w:t>
-      </w:r>
-      <w:r>
-        <w:rPr>
-          <w:rFonts w:ascii="Arial" w:cs="Arial" w:eastAsia="Arial" w:hAnsi="Arial"/>
-          <w:b/>
-          <w:bCs/>
-          <w:color w:val="555555"/>
-          <w:sz w:val="18"/>
-          <w:szCs w:val="18"/>
-        </w:rPr>
-        <w:t xml:space="preserve">Link:</w:t>
-      </w:r>
-      <w:r>
-        <w:rPr>
-          <w:rFonts w:ascii="Arial" w:cs="Arial" w:eastAsia="Arial" w:hAnsi="Arial"/>
-          <w:color w:val="555555"/>
-          <w:sz w:val="18"/>
-          <w:szCs w:val="18"/>
-        </w:rPr>
-        <w:t xml:space="preserve"> https://apowles.github.io/AP/AP%20A%20Level%20Oral%20Phrase%20Bank.html</w:t>
+        <w:t xml:space="preserve">   (opens the app in your browser)</w:t>
       </w:r>
     </w:p>
     <w:p>
       <w:pPr>
         <w:spacing w:after="120" w:line="276"/>
       </w:pPr>
-      <w:r>
-        <w:rPr>
-          <w:rFonts w:ascii="Arial" w:cs="Arial" w:eastAsia="Arial" w:hAnsi="Arial"/>
-          <w:sz w:val="22"/>
-          <w:szCs w:val="22"/>
-        </w:rPr>
-        <w:t xml:space="preserve"/>
-      </w:r>
       <w:r>
         <w:rPr>
           <w:rFonts w:ascii="Arial" w:cs="Arial" w:eastAsia="Arial" w:hAnsi="Arial"/>
@@ -21612,14 +20387,6 @@
       <w:r>
         <w:rPr>
           <w:rFonts w:ascii="Arial" w:cs="Arial" w:eastAsia="Arial" w:hAnsi="Arial"/>
-          <w:sz w:val="22"/>
-          <w:szCs w:val="22"/>
-        </w:rPr>
-        <w:t xml:space="preserve"/>
-      </w:r>
-      <w:r>
-        <w:rPr>
-          <w:rFonts w:ascii="Arial" w:cs="Arial" w:eastAsia="Arial" w:hAnsi="Arial"/>
           <w:b/>
           <w:bCs/>
           <w:sz w:val="22"/>
@@ -21681,14 +20448,6 @@
         </w:numPr>
         <w:spacing w:after="60" w:line="276"/>
       </w:pPr>
-      <w:r>
-        <w:rPr>
-          <w:rFonts w:ascii="Arial" w:cs="Arial" w:eastAsia="Arial" w:hAnsi="Arial"/>
-          <w:sz w:val="22"/>
-          <w:szCs w:val="22"/>
-        </w:rPr>
-        <w:t xml:space="preserve"/>
-      </w:r>
       <w:r>
         <w:rPr>
           <w:rFonts w:ascii="Arial" w:cs="Arial" w:eastAsia="Arial" w:hAnsi="Arial"/>
@@ -21985,14 +20744,6 @@
             <w:r>
               <w:rPr>
                 <w:rFonts w:ascii="Arial" w:cs="Arial" w:eastAsia="Arial" w:hAnsi="Arial"/>
-                <w:sz w:val="20"/>
-                <w:szCs w:val="20"/>
-              </w:rPr>
-              <w:t xml:space="preserve"/>
-            </w:r>
-            <w:r>
-              <w:rPr>
-                <w:rFonts w:ascii="Arial" w:cs="Arial" w:eastAsia="Arial" w:hAnsi="Arial"/>
                 <w:b/>
                 <w:bCs/>
                 <w:sz w:val="20"/>
@@ -22000,14 +20751,6 @@
               </w:rPr>
               <w:t xml:space="preserve">AP Oral Cycle</w:t>
             </w:r>
-            <w:r>
-              <w:rPr>
-                <w:rFonts w:ascii="Arial" w:cs="Arial" w:eastAsia="Arial" w:hAnsi="Arial"/>
-                <w:sz w:val="20"/>
-                <w:szCs w:val="20"/>
-              </w:rPr>
-              <w:t xml:space="preserve"/>
-            </w:r>
           </w:p>
         </w:tc>
         <w:tc>
@@ -22047,14 +20790,6 @@
                 <w:szCs w:val="20"/>
               </w:rPr>
               <w:t xml:space="preserve">⭐ All Oral Cycle (Q to C)</w:t>
-            </w:r>
-            <w:r>
-              <w:rPr>
-                <w:rFonts w:ascii="Arial" w:cs="Arial" w:eastAsia="Arial" w:hAnsi="Arial"/>
-                <w:sz w:val="20"/>
-                <w:szCs w:val="20"/>
-              </w:rPr>
-              <w:t xml:space="preserve"/>
             </w:r>
           </w:p>
         </w:tc>
@@ -22117,28 +20852,12 @@
             <w:r>
               <w:rPr>
                 <w:rFonts w:ascii="Arial" w:cs="Arial" w:eastAsia="Arial" w:hAnsi="Arial"/>
-                <w:sz w:val="20"/>
-                <w:szCs w:val="20"/>
-              </w:rPr>
-              <w:t xml:space="preserve"/>
-            </w:r>
-            <w:r>
-              <w:rPr>
-                <w:rFonts w:ascii="Arial" w:cs="Arial" w:eastAsia="Arial" w:hAnsi="Arial"/>
                 <w:b/>
                 <w:bCs/>
                 <w:sz w:val="20"/>
                 <w:szCs w:val="20"/>
               </w:rPr>
               <w:t xml:space="preserve">Taking the Lead</w:t>
-            </w:r>
-            <w:r>
-              <w:rPr>
-                <w:rFonts w:ascii="Arial" w:cs="Arial" w:eastAsia="Arial" w:hAnsi="Arial"/>
-                <w:sz w:val="20"/>
-                <w:szCs w:val="20"/>
-              </w:rPr>
-              <w:t xml:space="preserve"/>
             </w:r>
           </w:p>
         </w:tc>
@@ -22232,14 +20951,6 @@
             <w:r>
               <w:rPr>
                 <w:rFonts w:ascii="Arial" w:cs="Arial" w:eastAsia="Arial" w:hAnsi="Arial"/>
-                <w:sz w:val="20"/>
-                <w:szCs w:val="20"/>
-              </w:rPr>
-              <w:t xml:space="preserve"/>
-            </w:r>
-            <w:r>
-              <w:rPr>
-                <w:rFonts w:ascii="Arial" w:cs="Arial" w:eastAsia="Arial" w:hAnsi="Arial"/>
                 <w:b/>
                 <w:bCs/>
                 <w:sz w:val="20"/>
@@ -22247,14 +20958,6 @@
               </w:rPr>
               <w:t xml:space="preserve">AP Toolkit</w:t>
             </w:r>
-            <w:r>
-              <w:rPr>
-                <w:rFonts w:ascii="Arial" w:cs="Arial" w:eastAsia="Arial" w:hAnsi="Arial"/>
-                <w:sz w:val="20"/>
-                <w:szCs w:val="20"/>
-              </w:rPr>
-              <w:t xml:space="preserve"/>
-            </w:r>
           </w:p>
         </w:tc>
         <w:tc>
@@ -22294,14 +20997,6 @@
                 <w:szCs w:val="20"/>
               </w:rPr>
               <w:t xml:space="preserve">★ All AP Toolkit</w:t>
-            </w:r>
-            <w:r>
-              <w:rPr>
-                <w:rFonts w:ascii="Arial" w:cs="Arial" w:eastAsia="Arial" w:hAnsi="Arial"/>
-                <w:sz w:val="20"/>
-                <w:szCs w:val="20"/>
-              </w:rPr>
-              <w:t xml:space="preserve"/>
             </w:r>
           </w:p>
         </w:tc>
@@ -22426,14 +21121,6 @@
       <w:r>
         <w:rPr>
           <w:rFonts w:ascii="Arial" w:cs="Arial" w:eastAsia="Arial" w:hAnsi="Arial"/>
-          <w:sz w:val="22"/>
-          <w:szCs w:val="22"/>
-        </w:rPr>
-        <w:t xml:space="preserve"/>
-      </w:r>
-      <w:r>
-        <w:rPr>
-          <w:rFonts w:ascii="Arial" w:cs="Arial" w:eastAsia="Arial" w:hAnsi="Arial"/>
           <w:b/>
           <w:bCs/>
           <w:sz w:val="22"/>
@@ -22495,14 +21182,6 @@
         </w:numPr>
         <w:spacing w:after="60" w:line="276"/>
       </w:pPr>
-      <w:r>
-        <w:rPr>
-          <w:rFonts w:ascii="Arial" w:cs="Arial" w:eastAsia="Arial" w:hAnsi="Arial"/>
-          <w:sz w:val="22"/>
-          <w:szCs w:val="22"/>
-        </w:rPr>
-        <w:t xml:space="preserve"/>
-      </w:r>
       <w:r>
         <w:rPr>
           <w:rFonts w:ascii="Arial" w:cs="Arial" w:eastAsia="Arial" w:hAnsi="Arial"/>
@@ -22667,70 +21346,37 @@
     </w:p>
     <w:p>
       <w:pPr>
-        <w:spacing w:after="120" w:line="276"/>
-      </w:pPr>
-      <w:r>
-        <w:rPr>
-          <w:rFonts w:ascii="Arial" w:cs="Arial" w:eastAsia="Arial" w:hAnsi="Arial"/>
-          <w:color w:val="555555"/>
+        <w:keepNext/>
+        <w:spacing w:after="120" w:before="60"/>
+      </w:pPr>
+      <w:hyperlink w:history="1" r:id="rIdpyy3k2mkkazcjy6mkuiq7">
+        <w:r>
+          <w:rPr>
+            <w:rFonts w:ascii="Arial" w:cs="Arial" w:eastAsia="Arial" w:hAnsi="Arial"/>
+            <w:b/>
+            <w:bCs/>
+            <w:color w:val="0563C1"/>
+            <w:sz w:val="24"/>
+            <w:szCs w:val="24"/>
+            <w:u w:val="single"/>
+          </w:rPr>
+          <w:t xml:space="preserve">▶ Open AP Gen Essential Phrases</w:t>
+        </w:r>
+      </w:hyperlink>
+      <w:r>
+        <w:rPr>
+          <w:rFonts w:ascii="Arial" w:cs="Arial" w:eastAsia="Arial" w:hAnsi="Arial"/>
+          <w:color w:val="777777"/>
           <w:sz w:val="18"/>
           <w:szCs w:val="18"/>
         </w:rPr>
-        <w:t xml:space="preserve"/>
-      </w:r>
-      <w:r>
-        <w:rPr>
-          <w:rFonts w:ascii="Arial" w:cs="Arial" w:eastAsia="Arial" w:hAnsi="Arial"/>
-          <w:b/>
-          <w:bCs/>
-          <w:color w:val="555555"/>
-          <w:sz w:val="18"/>
-          <w:szCs w:val="18"/>
-        </w:rPr>
-        <w:t xml:space="preserve">Page name:</w:t>
-      </w:r>
-      <w:r>
-        <w:rPr>
-          <w:rFonts w:ascii="Arial" w:cs="Arial" w:eastAsia="Arial" w:hAnsi="Arial"/>
-          <w:color w:val="555555"/>
-          <w:sz w:val="18"/>
-          <w:szCs w:val="18"/>
-        </w:rPr>
-        <w:t xml:space="preserve"> AP Gen Essential Phrases.html   </w:t>
-      </w:r>
-      <w:r>
-        <w:rPr>
-          <w:rFonts w:ascii="Arial" w:cs="Arial" w:eastAsia="Arial" w:hAnsi="Arial"/>
-          <w:b/>
-          <w:bCs/>
-          <w:color w:val="555555"/>
-          <w:sz w:val="18"/>
-          <w:szCs w:val="18"/>
-        </w:rPr>
-        <w:t xml:space="preserve">Link:</w:t>
-      </w:r>
-      <w:r>
-        <w:rPr>
-          <w:rFonts w:ascii="Arial" w:cs="Arial" w:eastAsia="Arial" w:hAnsi="Arial"/>
-          <w:color w:val="555555"/>
-          <w:sz w:val="18"/>
-          <w:szCs w:val="18"/>
-        </w:rPr>
-        <w:t xml:space="preserve"> https://apowles.github.io/AP/AP%20Gen%20Essential%20Phrases.html</w:t>
+        <w:t xml:space="preserve">   (opens the app in your browser)</w:t>
       </w:r>
     </w:p>
     <w:p>
       <w:pPr>
         <w:spacing w:after="120" w:line="276"/>
       </w:pPr>
-      <w:r>
-        <w:rPr>
-          <w:rFonts w:ascii="Arial" w:cs="Arial" w:eastAsia="Arial" w:hAnsi="Arial"/>
-          <w:sz w:val="22"/>
-          <w:szCs w:val="22"/>
-        </w:rPr>
-        <w:t xml:space="preserve"/>
-      </w:r>
       <w:r>
         <w:rPr>
           <w:rFonts w:ascii="Arial" w:cs="Arial" w:eastAsia="Arial" w:hAnsi="Arial"/>
@@ -23850,14 +22496,6 @@
       <w:r>
         <w:rPr>
           <w:rFonts w:ascii="Arial" w:cs="Arial" w:eastAsia="Arial" w:hAnsi="Arial"/>
-          <w:sz w:val="22"/>
-          <w:szCs w:val="22"/>
-        </w:rPr>
-        <w:t xml:space="preserve"/>
-      </w:r>
-      <w:r>
-        <w:rPr>
-          <w:rFonts w:ascii="Arial" w:cs="Arial" w:eastAsia="Arial" w:hAnsi="Arial"/>
           <w:b/>
           <w:bCs/>
           <w:sz w:val="22"/>
@@ -23922,14 +22560,6 @@
       <w:r>
         <w:rPr>
           <w:rFonts w:ascii="Arial" w:cs="Arial" w:eastAsia="Arial" w:hAnsi="Arial"/>
-          <w:sz w:val="22"/>
-          <w:szCs w:val="22"/>
-        </w:rPr>
-        <w:t xml:space="preserve"/>
-      </w:r>
-      <w:r>
-        <w:rPr>
-          <w:rFonts w:ascii="Arial" w:cs="Arial" w:eastAsia="Arial" w:hAnsi="Arial"/>
           <w:b/>
           <w:bCs/>
           <w:sz w:val="22"/>
@@ -24030,14 +22660,6 @@
       <w:r>
         <w:rPr>
           <w:rFonts w:ascii="Arial" w:cs="Arial" w:eastAsia="Arial" w:hAnsi="Arial"/>
-          <w:sz w:val="22"/>
-          <w:szCs w:val="22"/>
-        </w:rPr>
-        <w:t xml:space="preserve"/>
-      </w:r>
-      <w:r>
-        <w:rPr>
-          <w:rFonts w:ascii="Arial" w:cs="Arial" w:eastAsia="Arial" w:hAnsi="Arial"/>
           <w:b/>
           <w:bCs/>
           <w:sz w:val="22"/>
@@ -24135,14 +22757,6 @@
         </w:numPr>
         <w:spacing w:after="60" w:line="276"/>
       </w:pPr>
-      <w:r>
-        <w:rPr>
-          <w:rFonts w:ascii="Arial" w:cs="Arial" w:eastAsia="Arial" w:hAnsi="Arial"/>
-          <w:sz w:val="22"/>
-          <w:szCs w:val="22"/>
-        </w:rPr>
-        <w:t xml:space="preserve"/>
-      </w:r>
       <w:r>
         <w:rPr>
           <w:rFonts w:ascii="Arial" w:cs="Arial" w:eastAsia="Arial" w:hAnsi="Arial"/>
@@ -24368,14 +22982,6 @@
       <w:r>
         <w:rPr>
           <w:rFonts w:ascii="Arial" w:cs="Arial" w:eastAsia="Arial" w:hAnsi="Arial"/>
-          <w:sz w:val="22"/>
-          <w:szCs w:val="22"/>
-        </w:rPr>
-        <w:t xml:space="preserve"/>
-      </w:r>
-      <w:r>
-        <w:rPr>
-          <w:rFonts w:ascii="Arial" w:cs="Arial" w:eastAsia="Arial" w:hAnsi="Arial"/>
           <w:b/>
           <w:bCs/>
           <w:sz w:val="22"/>
@@ -24547,14 +23153,6 @@
       <w:r>
         <w:rPr>
           <w:rFonts w:ascii="Arial" w:cs="Arial" w:eastAsia="Arial" w:hAnsi="Arial"/>
-          <w:sz w:val="22"/>
-          <w:szCs w:val="22"/>
-        </w:rPr>
-        <w:t xml:space="preserve"/>
-      </w:r>
-      <w:r>
-        <w:rPr>
-          <w:rFonts w:ascii="Arial" w:cs="Arial" w:eastAsia="Arial" w:hAnsi="Arial"/>
           <w:b/>
           <w:bCs/>
           <w:sz w:val="22"/>
@@ -24637,14 +23235,6 @@
       <w:r>
         <w:rPr>
           <w:rFonts w:ascii="Arial" w:cs="Arial" w:eastAsia="Arial" w:hAnsi="Arial"/>
-          <w:sz w:val="22"/>
-          <w:szCs w:val="22"/>
-        </w:rPr>
-        <w:t xml:space="preserve"/>
-      </w:r>
-      <w:r>
-        <w:rPr>
-          <w:rFonts w:ascii="Arial" w:cs="Arial" w:eastAsia="Arial" w:hAnsi="Arial"/>
           <w:b/>
           <w:bCs/>
           <w:sz w:val="22"/>
@@ -24673,14 +23263,6 @@
       <w:r>
         <w:rPr>
           <w:rFonts w:ascii="Arial" w:cs="Arial" w:eastAsia="Arial" w:hAnsi="Arial"/>
-          <w:sz w:val="22"/>
-          <w:szCs w:val="22"/>
-        </w:rPr>
-        <w:t xml:space="preserve"/>
-      </w:r>
-      <w:r>
-        <w:rPr>
-          <w:rFonts w:ascii="Arial" w:cs="Arial" w:eastAsia="Arial" w:hAnsi="Arial"/>
           <w:b/>
           <w:bCs/>
           <w:sz w:val="22"/>
@@ -24727,14 +23309,6 @@
       <w:r>
         <w:rPr>
           <w:rFonts w:ascii="Arial" w:cs="Arial" w:eastAsia="Arial" w:hAnsi="Arial"/>
-          <w:sz w:val="22"/>
-          <w:szCs w:val="22"/>
-        </w:rPr>
-        <w:t xml:space="preserve"/>
-      </w:r>
-      <w:r>
-        <w:rPr>
-          <w:rFonts w:ascii="Arial" w:cs="Arial" w:eastAsia="Arial" w:hAnsi="Arial"/>
           <w:b/>
           <w:bCs/>
           <w:sz w:val="22"/>
@@ -24796,14 +23370,6 @@
         </w:numPr>
         <w:spacing w:after="70" w:line="276"/>
       </w:pPr>
-      <w:r>
-        <w:rPr>
-          <w:rFonts w:ascii="Arial" w:cs="Arial" w:eastAsia="Arial" w:hAnsi="Arial"/>
-          <w:sz w:val="22"/>
-          <w:szCs w:val="22"/>
-        </w:rPr>
-        <w:t xml:space="preserve"/>
-      </w:r>
       <w:r>
         <w:rPr>
           <w:rFonts w:ascii="Arial" w:cs="Arial" w:eastAsia="Arial" w:hAnsi="Arial"/>

</xml_diff>

<commit_message>
Restamp the 13 apps; guides: practice tests cover the whole selection, actual test a fresh random draw, two or three practice tests
Co-Authored-By: Claude Sonnet 5.5 <noreply@anthropic.com>
Claude-Session: https://claude.ai/code/session_019tnY14TZs9VwDGTDQc2KDG
</commit_message>
<xml_diff>
--- a/Word documents/AP_A_Level_User_Guide.docx
+++ b/Word documents/AP_A_Level_User_Guide.docx
@@ -8413,7 +8413,7 @@
           <w:sz w:val="22"/>
           <w:szCs w:val="22"/>
         </w:rPr>
-        <w:t xml:space="preserve">AP often sets the same set as three practice tests (named, for example, "VV11b PRACTICE 1, 2 and 3") for you to do at home, then the </w:t>
+        <w:t xml:space="preserve">AP often sets the same set as two or three practice tests (named, for example, "VV11b PRACTICE 1, 2 and 3") for you to do at home, then the </w:t>
       </w:r>
       <w:r>
         <w:rPr>
@@ -8431,7 +8431,7 @@
           <w:sz w:val="22"/>
           <w:szCs w:val="22"/>
         </w:rPr>
-        <w:t xml:space="preserve"> in Birley 12. Your questions may differ from your neighbour's. Each of the four tests is drawn from across the whole selection AP chose, so the practice tests give you fresh questions rather than the same few again.</w:t>
+        <w:t xml:space="preserve"> in Birley 12. Your questions may differ from your neighbour's. Between them, the practice tests cover the whole selection AP chose, and the ACTUAL TEST is a fresh random draw from all of it, so learning just one practice test will not be enough.</w:t>
       </w:r>
     </w:p>
     <w:p>

</xml_diff>

<commit_message>
VVs Drill: three buttons (Topic Vocab Only, Verb Structures Only, Vocab and Verbs together); A Level guides updated; restamped
Co-Authored-By: Claude Sonnet 5.5 <noreply@anthropic.com>
Claude-Session: https://claude.ai/code/session_01S5rYTdm2Guhk5rucFAEyLg
</commit_message>
<xml_diff>
--- a/Word documents/AP_A_Level_User_Guide.docx
+++ b/Word documents/AP_A_Level_User_Guide.docx
@@ -18151,6 +18151,34 @@
           <w:szCs w:val="24"/>
         </w:rPr>
         <w:t xml:space="preserve">VVs Drill</w:t>
+      </w:r>
+    </w:p>
+    <w:p>
+      <w:pPr>
+        <w:pStyle w:val="ListParagraph"/>
+        <w:numPr>
+          <w:ilvl w:val="0"/>
+          <w:numId w:val="2"/>
+        </w:numPr>
+        <w:spacing w:after="60" w:line="276"/>
+      </w:pPr>
+      <w:r>
+        <w:rPr>
+          <w:rFonts w:ascii="Arial" w:cs="Arial" w:eastAsia="Arial" w:hAnsi="Arial"/>
+          <w:b/>
+          <w:bCs/>
+          <w:sz w:val="22"/>
+          <w:szCs w:val="22"/>
+        </w:rPr>
+        <w:t>What to practise:</w:t>
+      </w:r>
+      <w:r>
+        <w:rPr>
+          <w:rFonts w:ascii="Arial" w:cs="Arial" w:eastAsia="Arial" w:hAnsi="Arial"/>
+          <w:sz w:val="22"/>
+          <w:szCs w:val="22"/>
+        </w:rPr>
+        <w:t xml:space="preserve"> three buttons, Topic Vocab Only, Verb Structures Only and Vocab and Verbs together. Each weekly set is half topic vocabulary and half verb structures, so choose which half to drill, or both. The number of phrases and the cards shown follow your choice, and it is remembered next time.</w:t>
       </w:r>
     </w:p>
     <w:p>

</xml_diff>

<commit_message>
VVs Drill: three dropdowns (one per button); Generate Test, Spot Test, View & Print, Speed Challenge and PDFs follow the choice; guides; restamped
Co-Authored-By: Claude Sonnet 5.5 <noreply@anthropic.com>
Claude-Session: https://claude.ai/code/session_01S5rYTdm2Guhk5rucFAEyLg
</commit_message>
<xml_diff>
--- a/Word documents/AP_A_Level_User_Guide.docx
+++ b/Word documents/AP_A_Level_User_Guide.docx
@@ -18178,7 +18178,7 @@
           <w:sz w:val="22"/>
           <w:szCs w:val="22"/>
         </w:rPr>
-        <w:t xml:space="preserve"> three buttons, Topic Vocab Only, Verb Structures Only and Vocab and Verbs together. Each weekly set is half topic vocabulary and half verb structures, so choose which half to drill, or both. The number of phrases and the cards shown follow your choice, and it is remembered next time. The two Trials sets are always vocab and verbs together.</w:t>
+        <w:t xml:space="preserve"> three buttons, Topic Vocab Only, Verb Structures Only and Vocab and Verbs together. Each weekly set is half topic vocabulary and half verb structures, so choose which half to drill, or both. Each button has its own dropdown to pick the week (VV1a to VV12c, or a whole VV Entire), with the number of phrases beside it. Press a button, or change its dropdown, to choose; the highlighted one is used. Start Drill, Leisure Mode, Generate Test, the AP Spot Test, View &amp; Print and the Speed Challenge all use exactly what you chose. Your choice is remembered next time. The two Trials sets are only in the Vocab and Verbs together dropdown.</w:t>
       </w:r>
     </w:p>
     <w:p>
@@ -18198,7 +18198,7 @@
           <w:sz w:val="22"/>
           <w:szCs w:val="22"/>
         </w:rPr>
-        <w:t xml:space="preserve">Vocab Set:</w:t>
+        <w:t>The sets:</w:t>
       </w:r>
       <w:r>
         <w:rPr>

</xml_diff>